<commit_message>
fix(export): resolve XML malformation in BBLV template, map all contract tags and implement nearest station QĐ02 pricing in Infrastructure page
</commit_message>
<xml_diff>
--- a/tvt3_v2/public/templates/BBLV.docx
+++ b/tvt3_v2/public/templates/BBLV.docx
@@ -1,6 +1,2513 @@
 
-<file path=word/document.xml><?xml version="1.0" encoding="UTF-8" standalone="yes"?>
-<w:document xmlns:wpc="http://schemas.microsoft.com/office/word/2010/wordprocessingCanvas" xmlns:cx="http://schemas.microsoft.com/office/drawing/2014/chartex" xmlns:cx1="http://schemas.microsoft.com/office/drawing/2015/9/8/chartex" xmlns:cx2="http://schemas.microsoft.com/office/drawing/2015/10/21/chartex" xmlns:cx3="http://schemas.microsoft.com/office/drawing/2016/5/9/chartex" xmlns:cx4="http://schemas.microsoft.com/office/drawing/2016/5/10/chartex" xmlns:cx5="http://schemas.microsoft.com/office/drawing/2016/5/11/chartex" xmlns:cx6="http://schemas.microsoft.com/office/drawing/2016/5/12/chartex" xmlns:cx7="http://schemas.microsoft.com/office/drawing/2016/5/13/chartex" xmlns:cx8="http://schemas.microsoft.com/office/drawing/2016/5/14/chartex" xmlns:mc="http://schemas.openxmlformats.org/markup-compatibility/2006" xmlns:aink="http://schemas.microsoft.com/office/drawing/2016/ink" xmlns:am3d="http://schemas.microsoft.com/office/drawing/2017/model3d" xmlns:o="urn:schemas-microsoft-com:office:office" xmlns:r="http://schemas.openxmlformats.org/officeDocument/2006/relationships" xmlns:m="http://schemas.openxmlformats.org/officeDocument/2006/math" xmlns:v="urn:schemas-microsoft-com:vml" xmlns:wp14="http://schemas.microsoft.com/office/word/2010/wordprocessingDrawing" xmlns:wp="http://schemas.openxmlformats.org/drawingml/2006/wordprocessingDrawing" xmlns:w10="urn:schemas-microsoft-com:office:word" xmlns:w="http://schemas.openxmlformats.org/wordprocessingml/2006/main" xmlns:w14="http://schemas.microsoft.com/office/word/2010/wordml" xmlns:w15="http://schemas.microsoft.com/office/word/2012/wordml" xmlns:w16cid="http://schemas.microsoft.com/office/word/2016/wordml/cid" xmlns:w16se="http://schemas.microsoft.com/office/word/2015/wordml/symex" xmlns:wpg="http://schemas.microsoft.com/office/word/2010/wordprocessingGroup" xmlns:wpi="http://schemas.microsoft.com/office/word/2010/wordprocessingInk" xmlns:wne="http://schemas.microsoft.com/office/word/2006/wordml" xmlns:wps="http://schemas.microsoft.com/office/word/2010/wordprocessingShape" mc:Ignorable="w14 w15 w16se w16cid wp14"><w:body><w:tbl><w:tblPr><w:tblW w:w="9356" w:type="dxa"/><w:jc w:val="center"/><w:tblLook w:val="01E0" w:firstRow="1" w:lastRow="1" w:firstColumn="1" w:lastColumn="1" w:noHBand="0" w:noVBand="0"/></w:tblPr><w:tblGrid><w:gridCol w:w="9356"/></w:tblGrid><w:tr><w:trPr><w:jc w:val="center"/></w:trPr><w:tc><w:tcPr><w:tcW w:w="9356" w:type="dxa"/></w:tcPr><w:p><w:pPr><w:spacing w:line="240" w:lineRule="auto"/><w:jc w:val="center"/><w:rPr><w:rFonts w:ascii="Times New Roman" w:hAnsi="Times New Roman" w:cs="Times New Roman"/><w:b/><w:sz w:val="26"/><w:szCs w:val="26"/><w:lang w:val="nl-NL"/></w:rPr></w:pPr><w:r><w:rPr><w:rFonts w:ascii="Times New Roman" w:hAnsi="Times New Roman" w:cs="Times New Roman"/><w:b/><w:sz w:val="26"/><w:szCs w:val="26"/><w:lang w:val="nl-NL"/></w:rPr><w:t>CỘNG HÒA XÃ HỘI CHỦ NGHĨA VIỆT NAM</w:t></w:r></w:p></w:tc></w:tr><w:tr><w:trPr><w:jc w:val="center"/></w:trPr><w:tc><w:tcPr><w:tcW w:w="9356" w:type="dxa"/></w:tcPr><w:p><w:pPr><w:spacing w:line="240" w:lineRule="auto"/><w:jc w:val="center"/><w:rPr><w:rFonts w:ascii="Times New Roman" w:hAnsi="Times New Roman" w:cs="Times New Roman"/><w:b/><w:sz w:val="26"/><w:szCs w:val="26"/></w:rPr></w:pPr><w:r><w:rPr><w:rFonts w:ascii="Times New Roman" w:hAnsi="Times New Roman" w:cs="Times New Roman"/><w:noProof/><w:sz w:val="26"/><w:szCs w:val="26"/></w:rPr><mc:AlternateContent><mc:Choice Requires="wps"><w:drawing><wp:anchor distT="4294967295" distB="4294967295" distL="114300" distR="114300" simplePos="0" relativeHeight="251659264" behindDoc="0" locked="0" layoutInCell="1" allowOverlap="1" wp14:anchorId="0A5F695E" wp14:editId="0959EC28"><wp:simplePos x="0" y="0"/><wp:positionH relativeFrom="column"><wp:posOffset>1919605</wp:posOffset></wp:positionH><wp:positionV relativeFrom="paragraph"><wp:posOffset>225425</wp:posOffset></wp:positionV><wp:extent cx="1981200" cy="0"/><wp:effectExtent l="0" t="0" r="0" b="0"/><wp:wrapNone/><wp:docPr id="53" name="Straight Connector 53"/><wp:cNvGraphicFramePr><a:graphicFrameLocks xmlns:a="http://schemas.openxmlformats.org/drawingml/2006/main"/></wp:cNvGraphicFramePr><a:graphic xmlns:a="http://schemas.openxmlformats.org/drawingml/2006/main"><a:graphicData uri="http://schemas.microsoft.com/office/word/2010/wordprocessingShape"><wps:wsp><wps:cNvCnPr><a:cxnSpLocks noChangeShapeType="1"/></wps:cNvCnPr><wps:spPr bwMode="auto"><a:xfrm><a:off x="0" y="0"/><a:ext cx="1981200" cy="0"/></a:xfrm><a:prstGeom prst="line"><a:avLst/></a:prstGeom><a:noFill/><a:ln w="9525"><a:solidFill><a:srgbClr val="000000"/></a:solidFill><a:round/><a:headEnd/><a:tailEnd/></a:ln><a:extLst><a:ext uri="{909E8E84-426E-40DD-AFC4-6F175D3DCCD1}"><a14:hiddenFill xmlns:a14="http://schemas.microsoft.com/office/drawing/2010/main"><a:noFill/></a14:hiddenFill></a:ext></a:extLst></wps:spPr><wps:bodyPr/></wps:wsp></a:graphicData></a:graphic><wp14:sizeRelH relativeFrom="page"><wp14:pctWidth>0</wp14:pctWidth></wp14:sizeRelH><wp14:sizeRelV relativeFrom="page"><wp14:pctHeight>0</wp14:pctHeight></wp14:sizeRelV></wp:anchor></w:drawing></mc:Choice><mc:Fallback xmlns:w16sdtfl="http://schemas.microsoft.com/office/word/2024/wordml/sdtformatlock" xmlns:w16sdtdh="http://schemas.microsoft.com/office/word/2020/wordml/sdtdatahash" xmlns:w16du="http://schemas.microsoft.com/office/word/2023/wordml/word16du" xmlns:w16="http://schemas.microsoft.com/office/word/2018/wordml" xmlns:w16cex="http://schemas.microsoft.com/office/word/2018/wordml/cex" xmlns:oel="http://schemas.microsoft.com/office/2019/extlst"><w:pict><v:line w14:anchorId="678861B3" id="Straight Connector 53" o:spid="_x0000_s1026" style="position:absolute;z-index:251659264;visibility:visible;mso-wrap-style:square;mso-width-percent:0;mso-height-percent:0;mso-wrap-distance-left:9pt;mso-wrap-distance-top:-3e-5mm;mso-wrap-distance-right:9pt;mso-wrap-distance-bottom:-3e-5mm;mso-position-horizontal:absolute;mso-position-horizontal-relative:text;mso-position-vertical:absolute;mso-position-vertical-relative:text;mso-width-percent:0;mso-height-percent:0;mso-width-relative:page;mso-height-relative:page" from="151.15pt,17.75pt" to="307.15pt,17.75pt" o:gfxdata="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"/></w:pict></mc:Fallback></mc:AlternateContent></w:r><w:r><w:rPr><w:rFonts w:ascii="Times New Roman" w:hAnsi="Times New Roman" w:cs="Times New Roman"/><w:b/><w:sz w:val="26"/><w:szCs w:val="26"/></w:rPr><w:t>Độc lập - Tự do - Hạnh phúc</w:t></w:r></w:p></w:tc></w:tr></w:tbl><w:p><w:pPr><w:pStyle w:val="Heading1"/><w:spacing w:before="40" w:line="240" w:lineRule="auto"/><w:jc w:val="center"/><w:rPr><w:rFonts w:ascii="Times New Roman" w:hAnsi="Times New Roman" w:cs="Times New Roman"/><w:color w:val="auto"/><w:sz w:val="26"/><w:szCs w:val="26"/></w:rPr></w:pPr></w:p><w:p><w:pPr><w:pStyle w:val="Heading1"/><w:spacing w:before="40" w:line="240" w:lineRule="auto"/><w:jc w:val="center"/><w:rPr><w:rFonts w:ascii="Times New Roman" w:hAnsi="Times New Roman" w:cs="Times New Roman"/><w:color w:val="auto"/><w:sz w:val="26"/><w:szCs w:val="26"/></w:rPr></w:pPr><w:r><w:rPr><w:rFonts w:ascii="Times New Roman" w:hAnsi="Times New Roman" w:cs="Times New Roman"/><w:color w:val="auto"/><w:sz w:val="26"/><w:szCs w:val="26"/></w:rPr><w:t xml:space="preserve">BIÊN BẢN </w:t></w:r><w:r><w:rPr><w:rFonts w:ascii="Times New Roman" w:hAnsi="Times New Roman" w:cs="Times New Roman"/><w:color w:val="auto"/><w:sz w:val="26"/><w:szCs w:val="26"/></w:rPr><w:t>GHI NHỚ</w:t></w:r></w:p><w:p><w:pPr><w:pStyle w:val="Heading1"/><w:spacing w:before="40" w:line="240" w:lineRule="auto"/><w:jc w:val="center"/><w:rPr><w:rFonts w:ascii="Times New Roman" w:hAnsi="Times New Roman" w:cs="Times New Roman"/><w:color w:val="auto"/><w:sz w:val="26"/><w:szCs w:val="26"/></w:rPr></w:pPr><w:r><w:rPr><w:rFonts w:ascii="Times New Roman" w:hAnsi="Times New Roman" w:cs="Times New Roman"/><w:color w:val="auto"/><w:sz w:val="26"/><w:szCs w:val="26"/></w:rPr><w:t>KHẢO SÁT VỊ TRÍ XÂY DỰNG TRẠM BTS</w:t></w:r></w:p><w:p><w:pPr><w:spacing w:line="240" w:lineRule="auto"/><w:rPr><w:rFonts w:ascii="Times New Roman" w:hAnsi="Times New Roman" w:cs="Times New Roman"/><w:b/><w:bCs/><w:sz w:val="26"/><w:szCs w:val="26"/></w:rPr></w:pPr></w:p><w:p><w:pPr><w:pStyle w:val="ListParagraph"/><w:numPr><w:ilvl w:val="0"/><w:numId w:val="11"/></w:numPr><w:spacing w:line="240" w:lineRule="auto"/><w:ind w:left="450" w:hanging="270"/><w:rPr><w:rFonts w:ascii="Times New Roman" w:hAnsi="Times New Roman" w:cs="Times New Roman"/><w:b/><w:bCs/><w:sz w:val="26"/><w:szCs w:val="26"/></w:rPr></w:pPr><w:r><w:rPr><w:rFonts w:ascii="Times New Roman" w:hAnsi="Times New Roman" w:cs="Times New Roman"/><w:b/><w:bCs/><w:sz w:val="26"/><w:szCs w:val="26"/></w:rPr><w:t>THÔNG TIN CHUNG</w:t></w:r></w:p><w:tbl><w:tblPr><w:tblStyle w:val="TableGrid"/><w:tblW w:w="10102" w:type="dxa"/><w:tblInd w:w="-318" w:type="dxa"/><w:tblLook w:val="04A0" w:firstRow="1" w:lastRow="0" w:firstColumn="1" w:lastColumn="0" w:noHBand="0" w:noVBand="1"/></w:tblPr><w:tblGrid><w:gridCol w:w="2411"/><w:gridCol w:w="1759"/><w:gridCol w:w="2427"/><w:gridCol w:w="3505"/></w:tblGrid><w:tr><w:trPr><w:trHeight w:val="353"/></w:trPr><w:tc><w:tcPr><w:tcW w:w="6597" w:type="dxa"/><w:gridSpan w:val="3"/><w:vAlign w:val="center"/></w:tcPr><w:p><w:pPr><w:rPr><w:rFonts w:ascii="Times New Roman" w:hAnsi="Times New Roman" w:cs="Times New Roman"/><w:bCs/><w:sz w:val="26"/><w:szCs w:val="26"/></w:rPr></w:pPr><w:r><w:rPr><w:rFonts w:ascii="Times New Roman" w:hAnsi="Times New Roman" w:cs="Times New Roman"/><w:bCs/><w:sz w:val="26"/><w:szCs w:val="26"/></w:rPr><w:t>Tên trạm / ID trạm: {{SITE_ID}} / {{SITE_ID_OLD}}<w:rPr><w:rFonts w:ascii="Times New Roman" w:hAnsi="Times New Roman" w:cs="Times New Roman"/><w:bCs/><w:sz w:val="26"/><w:szCs w:val="26"/></w:rPr></w:pPr><w:r><w:rPr><w:rFonts w:ascii="Times New Roman" w:hAnsi="Times New Roman" w:cs="Times New Roman"/><w:bCs/><w:sz w:val="26"/><w:szCs w:val="26"/></w:rPr><w:t>Loại trạm: {{CLASSIFICATION_TYPE}}<w:tcPr><w:tcW w:w="10102" w:type="dxa"/><w:gridSpan w:val="4"/></w:tcPr><w:p><w:pPr><w:rPr><w:rFonts w:ascii="Times New Roman" w:hAnsi="Times New Roman" w:cs="Times New Roman"/><w:bCs/><w:sz w:val="26"/><w:szCs w:val="26"/></w:rPr></w:pPr><w:r><w:rPr><w:rFonts w:ascii="Times New Roman" w:hAnsi="Times New Roman" w:cs="Times New Roman"/><w:bCs/><w:sz w:val="26"/><w:szCs w:val="26"/></w:rPr><w:t xml:space="preserve">Ngày khảo sát: {{SURVEY_DATE}} </w:t></w:r></w:p></w:tc></w:tr><w:tr><w:trPr><w:trHeight w:val="339"/></w:trPr><w:tc><w:tcPr><w:tcW w:w="10102" w:type="dxa"/><w:gridSpan w:val="4"/></w:tcPr><w:p><w:pPr><w:rPr><w:rFonts w:ascii="Times New Roman" w:hAnsi="Times New Roman" w:cs="Times New Roman"/><w:bCs/><w:sz w:val="26"/><w:szCs w:val="26"/></w:rPr></w:pPr><w:r><w:rPr><w:rFonts w:ascii="Times New Roman" w:hAnsi="Times New Roman" w:cs="Times New Roman"/><w:bCs/><w:sz w:val="26"/><w:szCs w:val="26"/></w:rPr><w:t>Địa chỉ: {{ADDRESS}}<w:tcPr><w:tcW w:w="10102" w:type="dxa"/><w:gridSpan w:val="4"/></w:tcPr><w:p><w:pPr><w:rPr><w:rFonts w:ascii="Times New Roman" w:hAnsi="Times New Roman" w:cs="Times New Roman"/><w:bCs/><w:sz w:val="26"/><w:szCs w:val="26"/></w:rPr></w:pPr></w:p></w:tc></w:tr><w:tr><w:trPr><w:trHeight w:val="353"/></w:trPr><w:tc><w:tcPr><w:tcW w:w="2411" w:type="dxa"/></w:tcPr><w:p><w:pPr><w:jc w:val="center"/><w:rPr><w:rFonts w:ascii="Times New Roman" w:hAnsi="Times New Roman" w:cs="Times New Roman"/><w:bCs/><w:sz w:val="26"/><w:szCs w:val="26"/></w:rPr></w:pPr><w:r><w:rPr><w:rFonts w:ascii="Times New Roman" w:hAnsi="Times New Roman" w:cs="Times New Roman"/><w:bCs/><w:sz w:val="26"/><w:szCs w:val="26"/></w:rPr><w:t>Tọa độ TK: {{LATITUDE_PLAN}}, {{LONGITUDE_PLAN}}<w:jc w:val="center"/><w:rPr><w:rFonts w:ascii="Times New Roman" w:hAnsi="Times New Roman" w:cs="Times New Roman"/><w:bCs/><w:sz w:val="26"/><w:szCs w:val="26"/></w:rPr></w:pPr></w:p></w:tc><w:tc><w:tcPr><w:tcW w:w="2427" w:type="dxa"/></w:tcPr><w:p><w:pPr><w:jc w:val="center"/><w:rPr><w:rFonts w:ascii="Times New Roman" w:hAnsi="Times New Roman" w:cs="Times New Roman"/><w:bCs/><w:sz w:val="26"/><w:szCs w:val="26"/></w:rPr></w:pPr></w:p></w:tc><w:tc><w:tcPr><w:tcW w:w="3505" w:type="dxa"/><w:vMerge w:val="restart"/><w:vAlign w:val="center"/></w:tcPr><w:p><w:pPr><w:rPr><w:rFonts w:ascii="Times New Roman" w:hAnsi="Times New Roman" w:cs="Times New Roman"/><w:bCs/><w:sz w:val="26"/><w:szCs w:val="26"/></w:rPr></w:pPr><w:r><w:rPr><w:rFonts w:ascii="Times New Roman" w:hAnsi="Times New Roman" w:cs="Times New Roman"/><w:bCs/><w:sz w:val="26"/><w:szCs w:val="26"/><w:lang w:val="de-DE"/></w:rPr><w:t xml:space="preserve">Sai số (so với TK): {{OFFSET_DISTANCE}}          </w:t></w:r><w:r><w:rPr><w:rFonts w:ascii="Times New Roman" w:hAnsi="Times New Roman" w:cs="Times New Roman"/><w:bCs/><w:sz w:val="26"/><w:szCs w:val="26"/></w:rPr><w:t>(mét)</w:t></w:r></w:p></w:tc></w:tr><w:tr><w:trPr><w:trHeight w:val="339"/></w:trPr><w:tc><w:tcPr><w:tcW w:w="2411" w:type="dxa"/><w:vMerge w:val="restart"/><w:vAlign w:val="center"/></w:tcPr><w:p><w:pPr><w:jc w:val="center"/><w:rPr><w:rFonts w:ascii="Times New Roman" w:hAnsi="Times New Roman" w:cs="Times New Roman"/><w:bCs/><w:sz w:val="26"/><w:szCs w:val="26"/></w:rPr></w:pPr><w:r><w:rPr><w:rFonts w:ascii="Times New Roman" w:hAnsi="Times New Roman" w:cs="Times New Roman"/><w:bCs/><w:sz w:val="26"/><w:szCs w:val="26"/></w:rPr><w:t>Tọa độ KS: {{LATITUDE_SURVEY}}, {{LONGITUDE_SURVEY}}<w:jc w:val="center"/><w:rPr><w:rFonts w:ascii="Times New Roman" w:hAnsi="Times New Roman" w:cs="Times New Roman"/><w:bCs/><w:sz w:val="26"/><w:szCs w:val="26"/></w:rPr></w:pPr></w:p></w:tc><w:tc><w:tcPr><w:tcW w:w="2427" w:type="dxa"/></w:tcPr><w:p><w:pPr><w:jc w:val="center"/><w:rPr><w:rFonts w:ascii="Times New Roman" w:hAnsi="Times New Roman" w:cs="Times New Roman"/><w:bCs/><w:sz w:val="26"/><w:szCs w:val="26"/></w:rPr></w:pPr></w:p></w:tc><w:tc><w:tcPr><w:tcW w:w="3505" w:type="dxa"/><w:vMerge/></w:tcPr><w:p><w:pPr><w:jc w:val="center"/><w:rPr><w:rFonts w:ascii="Times New Roman" w:hAnsi="Times New Roman" w:cs="Times New Roman"/><w:bCs/><w:sz w:val="26"/><w:szCs w:val="26"/></w:rPr></w:pPr></w:p></w:tc></w:tr><w:tr><w:trPr><w:trHeight w:val="169"/></w:trPr><w:tc><w:tcPr><w:tcW w:w="2411" w:type="dxa"/><w:vMerge/></w:tcPr><w:p><w:pPr><w:jc w:val="center"/><w:rPr><w:rFonts w:ascii="Times New Roman" w:hAnsi="Times New Roman" w:cs="Times New Roman"/><w:bCs/><w:sz w:val="26"/><w:szCs w:val="26"/></w:rPr></w:pPr></w:p></w:tc><w:tc><w:tcPr><w:tcW w:w="1759" w:type="dxa"/></w:tcPr><w:p><w:pPr><w:jc w:val="center"/><w:rPr><w:rFonts w:ascii="Times New Roman" w:hAnsi="Times New Roman" w:cs="Times New Roman"/><w:bCs/><w:sz w:val="26"/><w:szCs w:val="26"/></w:rPr></w:pPr></w:p></w:tc><w:tc><w:tcPr><w:tcW w:w="2427" w:type="dxa"/></w:tcPr><w:p><w:pPr><w:jc w:val="center"/><w:rPr><w:rFonts w:ascii="Times New Roman" w:hAnsi="Times New Roman" w:cs="Times New Roman"/><w:bCs/><w:sz w:val="26"/><w:szCs w:val="26"/></w:rPr></w:pPr></w:p></w:tc><w:tc><w:tcPr><w:tcW w:w="3505" w:type="dxa"/><w:vMerge/></w:tcPr><w:p><w:pPr><w:jc w:val="center"/><w:rPr><w:rFonts w:ascii="Times New Roman" w:hAnsi="Times New Roman" w:cs="Times New Roman"/><w:bCs/><w:sz w:val="26"/><w:szCs w:val="26"/></w:rPr></w:pPr></w:p></w:tc></w:tr></w:tbl><w:p><w:pPr><w:spacing w:line="240" w:lineRule="auto"/><w:rPr><w:rFonts w:ascii="Times New Roman" w:hAnsi="Times New Roman" w:cs="Times New Roman"/><w:b/><w:bCs/><w:sz w:val="26"/><w:szCs w:val="26"/></w:rPr></w:pPr></w:p><w:p><w:pPr><w:spacing w:line="240" w:lineRule="auto"/><w:rPr><w:rFonts w:ascii="Times New Roman" w:hAnsi="Times New Roman" w:cs="Times New Roman"/><w:b/><w:bCs/><w:sz w:val="26"/><w:szCs w:val="26"/></w:rPr></w:pPr><w:r><w:rPr><w:rFonts w:ascii="Times New Roman" w:hAnsi="Times New Roman" w:cs="Times New Roman"/><w:b/><w:bCs/><w:sz w:val="26"/><w:szCs w:val="26"/></w:rPr><w:t xml:space="preserve">II. </w:t></w:r><w:r><w:rPr><w:rFonts w:ascii="Times New Roman" w:hAnsi="Times New Roman" w:cs="Times New Roman"/><w:b/><w:bCs/><w:sz w:val="26"/><w:szCs w:val="26"/></w:rPr><w:t>ĐẠI DIỆN CÁC BÊN</w:t></w:r></w:p><w:p><w:pPr><w:spacing w:line="240" w:lineRule="auto"/><w:rPr><w:rFonts w:ascii="Times New Roman" w:hAnsi="Times New Roman" w:cs="Times New Roman"/><w:sz w:val="26"/><w:szCs w:val="26"/></w:rPr></w:pPr><w:r><w:rPr><w:rFonts w:ascii="Times New Roman" w:hAnsi="Times New Roman" w:cs="Times New Roman"/><w:sz w:val="26"/><w:szCs w:val="26"/></w:rPr><w:t xml:space="preserve">1. Đại diện </w:t></w:r><w:r><w:rPr><w:rFonts w:ascii="Times New Roman" w:hAnsi="Times New Roman" w:cs="Times New Roman"/><w:sz w:val="26"/><w:szCs w:val="26"/></w:rPr><w:t>MobiFone Đồng Nai</w:t></w:r><w:r><w:rPr><w:rFonts w:ascii="Times New Roman" w:hAnsi="Times New Roman" w:cs="Times New Roman"/><w:sz w:val="26"/><w:szCs w:val="26"/></w:rPr><w:t>:</w:t></w:r></w:p><w:p><w:pPr><w:spacing w:line="240" w:lineRule="auto"/><w:rPr><w:rFonts w:ascii="Times New Roman" w:hAnsi="Times New Roman" w:cs="Times New Roman"/><w:sz w:val="26"/><w:szCs w:val="26"/></w:rPr></w:pPr><w:r><w:rPr><w:rFonts w:ascii="Times New Roman" w:hAnsi="Times New Roman" w:cs="Times New Roman"/><w:sz w:val="26"/><w:szCs w:val="26"/></w:rPr><w:t xml:space="preserve">- Người khảo sát: {{SURVEYOR}} ...................</w:t></w:r><w:r><w:rPr><w:rFonts w:ascii="Times New Roman" w:hAnsi="Times New Roman" w:cs="Times New Roman"/><w:sz w:val="26"/><w:szCs w:val="26"/></w:rPr><w:t>........</w:t></w:r><w:r><w:rPr><w:rFonts w:ascii="Times New Roman" w:hAnsi="Times New Roman" w:cs="Times New Roman"/><w:sz w:val="26"/><w:szCs w:val="26"/></w:rPr><w:t>......</w:t></w:r><w:r><w:rPr><w:rFonts w:ascii="Times New Roman" w:hAnsi="Times New Roman" w:cs="Times New Roman"/><w:sz w:val="26"/><w:szCs w:val="26"/></w:rPr><w:t>...</w:t></w:r><w:r><w:rPr><w:rFonts w:ascii="Times New Roman" w:hAnsi="Times New Roman" w:cs="Times New Roman"/><w:sz w:val="26"/><w:szCs w:val="26"/></w:rPr><w:t xml:space="preserve"> </w:t></w:r><w:r><w:rPr><w:rFonts w:ascii="Times New Roman" w:hAnsi="Times New Roman" w:cs="Times New Roman"/><w:sz w:val="26"/><w:szCs w:val="26"/></w:rPr><w:t>…</w:t></w:r><w:r><w:rPr><w:rFonts w:ascii="Times New Roman" w:hAnsi="Times New Roman" w:cs="Times New Roman"/><w:sz w:val="26"/><w:szCs w:val="26"/></w:rPr><w:t>Chức vụ</w:t></w:r><w:r><w:rPr><w:rFonts w:ascii="Times New Roman" w:hAnsi="Times New Roman" w:cs="Times New Roman"/><w:sz w:val="26"/><w:szCs w:val="26"/></w:rPr><w:t>: .......................</w:t></w:r><w:r><w:rPr><w:rFonts w:ascii="Times New Roman" w:hAnsi="Times New Roman" w:cs="Times New Roman"/><w:sz w:val="26"/><w:szCs w:val="26"/></w:rPr><w:t>........</w:t></w:r><w:r><w:rPr><w:rFonts w:ascii="Times New Roman" w:hAnsi="Times New Roman" w:cs="Times New Roman"/><w:sz w:val="26"/><w:szCs w:val="26"/></w:rPr><w:t>..................</w:t></w:r><w:r><w:rPr><w:rFonts w:ascii="Times New Roman" w:hAnsi="Times New Roman" w:cs="Times New Roman"/><w:sz w:val="26"/><w:szCs w:val="26"/></w:rPr><w:t>....</w:t></w:r><w:r><w:rPr><w:rFonts w:ascii="Times New Roman" w:hAnsi="Times New Roman" w:cs="Times New Roman"/><w:sz w:val="26"/><w:szCs w:val="26"/></w:rPr><w:t>.</w:t></w:r><w:r><w:rPr><w:rFonts w:ascii="Times New Roman" w:hAnsi="Times New Roman" w:cs="Times New Roman"/><w:sz w:val="26"/><w:szCs w:val="26"/></w:rPr><w:t>....</w:t></w:r><w:r><w:rPr><w:rFonts w:ascii="Times New Roman" w:hAnsi="Times New Roman" w:cs="Times New Roman"/><w:sz w:val="26"/><w:szCs w:val="26"/></w:rPr><w:t>.</w:t></w:r></w:p><w:p><w:pPr><w:spacing w:line="240" w:lineRule="auto"/><w:rPr><w:rFonts w:ascii="Times New Roman" w:hAnsi="Times New Roman" w:cs="Times New Roman"/><w:sz w:val="26"/><w:szCs w:val="26"/></w:rPr></w:pPr><w:r><w:rPr><w:rFonts w:ascii="Times New Roman" w:hAnsi="Times New Roman" w:cs="Times New Roman"/><w:sz w:val="26"/><w:szCs w:val="26"/></w:rPr><w:t xml:space="preserve">- Người kiểm tra: {{CHECKER}} ...............................</w:t></w:r><w:r><w:rPr><w:rFonts w:ascii="Times New Roman" w:hAnsi="Times New Roman" w:cs="Times New Roman"/><w:sz w:val="26"/><w:szCs w:val="26"/></w:rPr><w:t>........</w:t></w:r><w:r><w:rPr><w:rFonts w:ascii="Times New Roman" w:hAnsi="Times New Roman" w:cs="Times New Roman"/><w:sz w:val="26"/><w:szCs w:val="26"/></w:rPr><w:t>.....</w:t></w:r><w:r><w:rPr><w:rFonts w:ascii="Times New Roman" w:hAnsi="Times New Roman" w:cs="Times New Roman"/><w:sz w:val="26"/><w:szCs w:val="26"/></w:rPr><w:t xml:space="preserve">Chức vụ: </w:t></w:r><w:r><w:rPr><w:rFonts w:ascii="Times New Roman" w:hAnsi="Times New Roman" w:cs="Times New Roman"/><w:sz w:val="26"/><w:szCs w:val="26"/></w:rPr><w:t>...</w:t></w:r><w:r><w:rPr><w:rFonts w:ascii="Times New Roman" w:hAnsi="Times New Roman" w:cs="Times New Roman"/><w:sz w:val="26"/><w:szCs w:val="26"/></w:rPr><w:t>.................</w:t></w:r><w:r><w:rPr><w:rFonts w:ascii="Times New Roman" w:hAnsi="Times New Roman" w:cs="Times New Roman"/><w:sz w:val="26"/><w:szCs w:val="26"/></w:rPr><w:t>................................</w:t></w:r><w:r><w:rPr><w:rFonts w:ascii="Times New Roman" w:hAnsi="Times New Roman" w:cs="Times New Roman"/><w:sz w:val="26"/><w:szCs w:val="26"/></w:rPr><w:t>....</w:t></w:r></w:p><w:p><w:pPr><w:spacing w:line="240" w:lineRule="auto"/><w:rPr><w:rFonts w:ascii="Times New Roman" w:hAnsi="Times New Roman" w:cs="Times New Roman"/><w:sz w:val="26"/><w:szCs w:val="26"/></w:rPr></w:pPr><w:r><w:rPr><w:rFonts w:ascii="Times New Roman" w:hAnsi="Times New Roman" w:cs="Times New Roman"/><w:sz w:val="26"/><w:szCs w:val="26"/></w:rPr><w:t>2. Đại diện chủ đất/chủ nhà</w:t></w:r><w:r><w:rPr><w:rFonts w:ascii="Times New Roman" w:hAnsi="Times New Roman" w:cs="Times New Roman"/><w:sz w:val="26"/><w:szCs w:val="26"/></w:rPr><w:t>/bên cho thuê</w:t></w:r><w:r><w:rPr><w:rFonts w:ascii="Times New Roman" w:hAnsi="Times New Roman" w:cs="Times New Roman"/><w:sz w:val="26"/><w:szCs w:val="26"/></w:rPr><w:t>:</w:t></w:r></w:p><w:p><w:pPr><w:spacing w:line="240" w:lineRule="auto"/><w:rPr><w:rFonts w:ascii="Times New Roman" w:hAnsi="Times New Roman" w:cs="Times New Roman"/><w:sz w:val="26"/><w:szCs w:val="26"/></w:rPr></w:pPr><w:r><w:rPr><w:rFonts w:ascii="Times New Roman" w:hAnsi="Times New Roman" w:cs="Times New Roman"/><w:sz w:val="26"/><w:szCs w:val="26"/></w:rPr><w:t>- Tên cơ quan (gia đình): {{COMPANY_NAME}}…………………………………………………………………….</w:t></w:r></w:p><w:p><w:pPr><w:spacing w:line="240" w:lineRule="auto"/><w:rPr><w:rFonts w:ascii="Times New Roman" w:hAnsi="Times New Roman" w:cs="Times New Roman"/><w:sz w:val="26"/><w:szCs w:val="26"/></w:rPr></w:pPr><w:r><w:rPr><w:rFonts w:ascii="Times New Roman" w:hAnsi="Times New Roman" w:cs="Times New Roman"/><w:sz w:val="26"/><w:szCs w:val="26"/></w:rPr><w:t>- Họ tên người đại diện: {{LANDLORD_NAME}} </w:t></w:r><w:r><w:rPr><w:rFonts w:ascii="Times New Roman" w:hAnsi="Times New Roman" w:cs="Times New Roman"/><w:sz w:val="26"/><w:szCs w:val="26"/></w:rPr><w:t>.............................</w:t></w:r><w:r><w:rPr><w:rFonts w:ascii="Times New Roman" w:hAnsi="Times New Roman" w:cs="Times New Roman"/><w:sz w:val="26"/><w:szCs w:val="26"/></w:rPr><w:t>........................</w:t></w:r><w:r><w:rPr><w:rFonts w:ascii="Times New Roman" w:hAnsi="Times New Roman" w:cs="Times New Roman"/><w:sz w:val="26"/><w:szCs w:val="26"/></w:rPr><w:t xml:space="preserve">  SĐT: {{LANDLORD_PHONE}} ...............</w:t></w:r><w:r><w:rPr><w:rFonts w:ascii="Times New Roman" w:hAnsi="Times New Roman" w:cs="Times New Roman"/><w:sz w:val="26"/><w:szCs w:val="26"/></w:rPr><w:t>.........................</w:t></w:r></w:p><w:p><w:pPr><w:spacing w:line="240" w:lineRule="auto"/><w:rPr><w:rFonts w:ascii="Times New Roman" w:hAnsi="Times New Roman" w:cs="Times New Roman"/><w:sz w:val="26"/><w:szCs w:val="26"/></w:rPr></w:pPr><w:r><w:rPr><w:rFonts w:ascii="Times New Roman" w:hAnsi="Times New Roman" w:cs="Times New Roman"/><w:sz w:val="26"/><w:szCs w:val="26"/></w:rPr><w:t>- CCCD/CMND: {{LANDLORD_CCCD}} .......................................................</w:t></w:r><w:r><w:rPr><w:rFonts w:ascii="Times New Roman" w:hAnsi="Times New Roman" w:cs="Times New Roman"/><w:sz w:val="26"/><w:szCs w:val="26"/></w:rPr><w:t>.................</w:t></w:r><w:r><w:rPr><w:rFonts w:ascii="Times New Roman" w:hAnsi="Times New Roman" w:cs="Times New Roman"/><w:sz w:val="26"/><w:szCs w:val="26"/></w:rPr><w:t>.........................................</w:t></w:r><w:r><w:rPr><w:rFonts w:ascii="Times New Roman" w:hAnsi="Times New Roman" w:cs="Times New Roman"/><w:sz w:val="26"/><w:szCs w:val="26"/></w:rPr><w:t>..</w:t></w:r></w:p><w:p><w:pPr><w:tabs><w:tab w:val="left" w:pos="4222"/></w:tabs><w:rPr><w:rFonts w:ascii="Times New Roman" w:hAnsi="Times New Roman" w:cs="Times New Roman"/><w:b/><w:sz w:val="26"/><w:szCs w:val="26"/></w:rPr></w:pPr><w:r><w:rPr><w:rFonts w:ascii="Times New Roman" w:hAnsi="Times New Roman" w:cs="Times New Roman"/><w:b/><w:sz w:val="26"/><w:szCs w:val="26"/></w:rPr><w:t xml:space="preserve">III. </w:t></w:r><w:r><w:rPr><w:rFonts w:ascii="Times New Roman" w:hAnsi="Times New Roman" w:cs="Times New Roman"/><w:b/><w:sz w:val="26"/><w:szCs w:val="26"/></w:rPr><w:t>KẾT QUẢ KHẢO SÁT</w:t></w:r></w:p><w:p><w:pPr><w:tabs><w:tab w:val="left" w:pos="4222"/></w:tabs><w:rPr><w:rFonts w:ascii="Times New Roman" w:hAnsi="Times New Roman" w:cs="Times New Roman"/><w:sz w:val="26"/><w:szCs w:val="26"/></w:rPr></w:pPr><w:r><w:rPr><w:rFonts w:ascii="Times New Roman" w:hAnsi="Times New Roman" w:cs="Times New Roman"/><w:sz w:val="26"/><w:szCs w:val="26"/></w:rPr><w:t xml:space="preserve">Đơn vị cho thuê </w:t></w:r><w:r><w:rPr><w:rFonts w:ascii="Times New Roman" w:hAnsi="Times New Roman" w:cs="Times New Roman"/><w:sz w:val="26"/><w:szCs w:val="26"/></w:rPr><w:t xml:space="preserve">(Bên </w:t></w:r><w:r><w:rPr><w:rFonts w:ascii="Times New Roman" w:hAnsi="Times New Roman" w:cs="Times New Roman"/><w:sz w:val="26"/><w:szCs w:val="26"/></w:rPr><w:t>B</w:t></w:r><w:r><w:rPr><w:rFonts w:ascii="Times New Roman" w:hAnsi="Times New Roman" w:cs="Times New Roman"/><w:sz w:val="26"/><w:szCs w:val="26"/></w:rPr><w:t>)</w:t></w:r><w:r><w:rPr><w:rFonts w:ascii="Times New Roman" w:hAnsi="Times New Roman" w:cs="Times New Roman"/><w:sz w:val="26"/><w:szCs w:val="26"/></w:rPr><w:t xml:space="preserve"> đồng ý cho MobiFone Đồng Nai thuê mặt bằng để xây dựng/lắp đặt trạm điện thoại di động BTS với những </w:t></w:r><w:r><w:rPr><w:rFonts w:ascii="Times New Roman" w:hAnsi="Times New Roman" w:cs="Times New Roman"/><w:sz w:val="26"/><w:szCs w:val="26"/></w:rPr><w:t>thông tin</w:t></w:r><w:r><w:rPr><w:rFonts w:ascii="Times New Roman" w:hAnsi="Times New Roman" w:cs="Times New Roman"/><w:sz w:val="26"/><w:szCs w:val="26"/></w:rPr><w:t xml:space="preserve"> như sau:</w:t></w:r></w:p><w:p><w:pPr><w:spacing w:line="240" w:lineRule="auto"/><w:rPr><w:rFonts w:ascii="Times New Roman" w:hAnsi="Times New Roman" w:cs="Times New Roman"/><w:sz w:val="26"/><w:szCs w:val="26"/></w:rPr></w:pPr><w:r><w:rPr><w:rFonts w:ascii="Times New Roman" w:hAnsi="Times New Roman" w:cs="Times New Roman"/><w:sz w:val="26"/><w:szCs w:val="26"/></w:rPr><w:t xml:space="preserve">- </w:t></w:r><w:r><w:rPr><w:rFonts w:ascii="Times New Roman" w:hAnsi="Times New Roman" w:cs="Times New Roman"/><w:sz w:val="26"/><w:szCs w:val="26"/></w:rPr><w:t>Vị trí d</w:t></w:r><w:r><w:rPr><w:rFonts w:ascii="Times New Roman" w:hAnsi="Times New Roman" w:cs="Times New Roman"/><w:sz w:val="26"/><w:szCs w:val="26"/></w:rPr><w:t>ự</w:t></w:r><w:r><w:rPr><w:rFonts w:ascii="Times New Roman" w:hAnsi="Times New Roman" w:cs="Times New Roman"/><w:sz w:val="26"/><w:szCs w:val="26"/></w:rPr><w:t>ng cột anten</w:t></w:r><w:r><w:rPr><w:rFonts w:ascii="Times New Roman" w:hAnsi="Times New Roman" w:cs="Times New Roman"/><w:sz w:val="26"/><w:szCs w:val="26"/></w:rPr><w:t xml:space="preserve">: </w:t></w:r><w:r><w:rPr><w:rFonts w:ascii="Segoe UI Symbol" w:hAnsi="Segoe UI Symbol" w:cs="Segoe UI Symbol"/><w:sz w:val="26"/><w:szCs w:val="26"/></w:rPr><w:t>{{#IS_MAT_DAT}}☑{{/IS_MAT_DAT}}{{^IS_MAT_DAT}}☐{{/IS_MAT_DAT}} Mặt đất<w:r><w:rPr><w:rFonts w:ascii="Times New Roman" w:hAnsi="Times New Roman" w:cs="Times New Roman"/><w:sz w:val="26"/><w:szCs w:val="26"/></w:rPr><w:tab/></w:r><w:r><w:rPr><w:rFonts w:ascii="Segoe UI Symbol" w:hAnsi="Segoe UI Symbol" w:cs="Segoe UI Symbol"/><w:sz w:val="26"/><w:szCs w:val="26"/></w:rPr><w:t>{{#IS_MAI_NHA}}☑{{/IS_MAI_NHA}}{{^IS_MAI_NHA}}☐{{/IS_MAI_NHA}} Mái nhà: {{ROOF_SHEETS}} tấm, cao {{ROOF_HEIGHT}} mét…… tấm, cao……. mét</w:t></w:r></w:p><w:p><w:pPr><w:spacing w:line="240" w:lineRule="auto"/><w:rPr><w:rFonts w:ascii="Times New Roman" w:hAnsi="Times New Roman" w:cs="Times New Roman"/><w:sz w:val="26"/><w:szCs w:val="26"/></w:rPr></w:pPr><w:r><w:rPr><w:rFonts w:ascii="Times New Roman" w:hAnsi="Times New Roman" w:cs="Times New Roman"/><w:sz w:val="26"/><w:szCs w:val="26"/></w:rPr><w:t>- Ghi chú đặc điểm đất, nhà: {{SURVEY_NOTES}} (</w:t></w:r><w:r><w:rPr><w:rFonts w:ascii="Times New Roman" w:hAnsi="Times New Roman" w:cs="Times New Roman"/><w:i/><w:iCs/><w:sz w:val="26"/><w:szCs w:val="26"/></w:rPr><w:t>đồi, núi, ao, đầm lầy, ruộng, đất độ dốc, gần taluy, gần sông hồ, điện cao thế, trung thế,</w:t></w:r><w:r><w:rPr><w:rFonts w:ascii="Times New Roman" w:hAnsi="Times New Roman" w:cs="Times New Roman"/><w:i/><w:iCs/><w:sz w:val="26"/><w:szCs w:val="26"/></w:rPr><w:t xml:space="preserve">loại </w:t></w:r><w:r><w:rPr><w:rFonts w:ascii="Times New Roman" w:hAnsi="Times New Roman" w:cs="Times New Roman"/><w:i/><w:iCs/><w:sz w:val="26"/><w:szCs w:val="26"/></w:rPr><w:t>mái nhà,</w:t></w:r><w:r><w:rPr><w:rFonts w:ascii="Times New Roman" w:hAnsi="Times New Roman" w:cs="Times New Roman"/><w:i/><w:iCs/><w:sz w:val="26"/><w:szCs w:val="26"/></w:rPr><w:t>…</w:t></w:r><w:r><w:rPr><w:rFonts w:ascii="Times New Roman" w:hAnsi="Times New Roman" w:cs="Times New Roman"/><w:sz w:val="26"/><w:szCs w:val="26"/></w:rPr><w:t>) ……………………………………….</w:t></w:r></w:p><w:p><w:pPr><w:spacing w:line="240" w:lineRule="auto"/><w:rPr><w:rFonts w:ascii="Times New Roman" w:hAnsi="Times New Roman" w:cs="Times New Roman"/><w:sz w:val="26"/><w:szCs w:val="26"/></w:rPr></w:pPr><w:r><w:rPr><w:rFonts w:ascii="Times New Roman" w:hAnsi="Times New Roman" w:cs="Times New Roman"/><w:sz w:val="26"/><w:szCs w:val="26"/></w:rPr><w:t xml:space="preserve">- </w:t></w:r><w:r><w:rPr><w:rFonts w:ascii="Times New Roman" w:hAnsi="Times New Roman" w:cs="Times New Roman"/><w:sz w:val="26"/><w:szCs w:val="26"/></w:rPr><w:t>Kích thước DxR khu đất/mái nhà: {{LAND_DIMENSIONS}} m…………..m       </w:t></w:r></w:p><w:p><w:pPr><w:spacing w:line="240" w:lineRule="auto"/><w:rPr><w:rFonts w:ascii="Times New Roman" w:hAnsi="Times New Roman" w:cs="Times New Roman"/><w:sz w:val="26"/><w:szCs w:val="26"/></w:rPr></w:pPr><w:r><w:rPr><w:rFonts w:ascii="Times New Roman" w:hAnsi="Times New Roman" w:cs="Times New Roman"/><w:sz w:val="26"/><w:szCs w:val="26"/></w:rPr><w:t>- Kích thước dự kiến thuê sử dụng xây dựng trạm (DxR): {{LEASED_DIMENSIONS}} m (Diện tích: {{LEASED_AREA}} m²) .......... </w:t></w:r><w:r><w:rPr><w:rFonts w:ascii="Times New Roman" w:hAnsi="Times New Roman" w:cs="Times New Roman"/><w:sz w:val="26"/><w:szCs w:val="26"/></w:rPr><w:t>m……….</w:t></w:r><w:r><w:rPr><w:rFonts w:ascii="Times New Roman" w:hAnsi="Times New Roman" w:cs="Times New Roman"/><w:sz w:val="26"/><w:szCs w:val="26"/></w:rPr><w:t>m²</w:t></w:r></w:p><w:p><w:pPr><w:spacing w:line="240" w:lineRule="auto"/><w:rPr><w:rFonts w:ascii="Times New Roman" w:hAnsi="Times New Roman" w:cs="Times New Roman"/><w:sz w:val="26"/><w:szCs w:val="26"/></w:rPr></w:pPr><w:r><w:rPr><w:rFonts w:ascii="Times New Roman" w:hAnsi="Times New Roman" w:cs="Times New Roman"/><w:sz w:val="26"/><w:szCs w:val="26"/></w:rPr><w:lastRenderedPageBreak/><w:t xml:space="preserve">- Đường vào: </w:t></w:r><w:r><w:rPr><w:rFonts w:ascii="Times New Roman" w:hAnsi="Times New Roman" w:cs="Times New Roman"/><w:sz w:val="26"/><w:szCs w:val="26"/></w:rPr><w:tab/></w:r><w:r><w:rPr><w:rFonts w:ascii="Segoe UI Symbol" w:hAnsi="Segoe UI Symbol" w:cs="Segoe UI Symbol"/><w:sz w:val="26"/><w:szCs w:val="26"/></w:rPr><w:t>{{#ACCESS_CAR}}☑{{/ACCESS_CAR}}{{^ACCESS_CAR}}☐{{/ACCESS_CAR}} Ô tô </w:t></w:r><w:r><w:rPr><w:rFonts w:ascii="Times New Roman" w:hAnsi="Times New Roman" w:cs="Times New Roman"/><w:sz w:val="26"/><w:szCs w:val="26"/></w:rPr><w:tab/></w:r><w:r><w:rPr><w:rFonts w:ascii="Segoe UI Symbol" w:hAnsi="Segoe UI Symbol" w:cs="Segoe UI Symbol"/><w:sz w:val="26"/><w:szCs w:val="26"/></w:rPr><w:t>{{#ACCESS_BIKE}}☑{{/ACCESS_BIKE}}{{^ACCESS_BIKE}}☐{{/ACCESS_BIKE}} Xe máy </w:t></w:r><w:r><w:rPr><w:rFonts w:ascii="Times New Roman" w:hAnsi="Times New Roman" w:cs="Times New Roman"/><w:sz w:val="26"/><w:szCs w:val="26"/></w:rPr><w:tab/></w:r><w:r><w:rPr><w:rFonts w:ascii="Times New Roman" w:hAnsi="Times New Roman" w:cs="Times New Roman"/><w:sz w:val="26"/><w:szCs w:val="26"/></w:rPr><w:tab/></w:r><w:r><w:rPr><w:rFonts w:ascii="Segoe UI Symbol" w:hAnsi="Segoe UI Symbol" w:cs="Segoe UI Symbol"/><w:sz w:val="26"/><w:szCs w:val="26"/></w:rPr><w:t>{{#ACCESS_WALK}}☑{{/ACCESS_WALK}}{{^ACCESS_WALK}}☐{{/ACCESS_WALK}} Đi bộ</w:rPr></w:pPr><w:r><w:rPr><w:rFonts w:ascii="Times New Roman" w:hAnsi="Times New Roman" w:cs="Times New Roman"/><w:sz w:val="26"/><w:szCs w:val="26"/></w:rPr><w:t xml:space="preserve">- Nguồn điện lưới: </w:t></w:r><w:r><w:rPr><w:rFonts w:ascii="Segoe UI Symbol" w:hAnsi="Segoe UI Symbol" w:cs="Segoe UI Symbol"/><w:sz w:val="26"/><w:szCs w:val="26"/></w:rPr><w:t>{{#POWER_DIRECT}}☑{{/POWER_DIRECT}}{{^POWER_DIRECT}}☐{{/POWER_DIRECT}} điện kế ĐL </w:t></w:r><w:r><w:rPr><w:rFonts w:ascii="Times New Roman" w:hAnsi="Times New Roman" w:cs="Times New Roman"/><w:sz w:val="26"/><w:szCs w:val="26"/></w:rPr><w:t xml:space="preserve">   </w:t></w:r><w:r><w:rPr><w:rFonts w:ascii="Segoe UI Symbol" w:hAnsi="Segoe UI Symbol" w:cs="Segoe UI Symbol"/><w:sz w:val="26"/><w:szCs w:val="26"/></w:rPr><w:t>{{#POWER_SHARE}}☑{{/POWER_SHARE}}{{^POWER_SHARE}}☐{{/POWER_SHARE}} không có hạ thế, câu đuôi     </w:t></w:r><w:r><w:rPr><w:rFonts w:ascii="Segoe UI Symbol" w:hAnsi="Segoe UI Symbol" w:cs="Segoe UI Symbol"/><w:sz w:val="26"/><w:szCs w:val="26"/></w:rPr><w:t>{{#POWER_SUBSTATION}}☑{{/POWER_SUBSTATION}}{{^POWER_SUBSTATION}}☐{{/POWER_SUBSTATION}} trang bị MBA riêng</w:p><w:p><w:pPr><w:spacing w:line="240" w:lineRule="auto"/><w:rPr><w:rFonts w:ascii="Times New Roman" w:hAnsi="Times New Roman" w:cs="Times New Roman"/><w:sz w:val="26"/><w:szCs w:val="26"/></w:rPr></w:pPr><w:r><w:rPr><w:rFonts w:ascii="Times New Roman" w:hAnsi="Times New Roman" w:cs="Times New Roman"/><w:sz w:val="26"/><w:szCs w:val="26"/></w:rPr><w:t>- Khoảng cách đến vị trí đấu điện lưới dự kiến: {{POWER_DISTANCE}} m…………………………………………….</w:t></w:r></w:p><w:p><w:pPr><w:spacing w:line="240" w:lineRule="auto"/><w:rPr><w:rFonts w:ascii="Times New Roman" w:hAnsi="Times New Roman" w:cs="Times New Roman"/><w:sz w:val="26"/><w:szCs w:val="26"/></w:rPr></w:pPr><w:r><w:rPr><w:rFonts w:ascii="Times New Roman" w:hAnsi="Times New Roman" w:cs="Times New Roman"/><w:sz w:val="26"/><w:szCs w:val="26"/></w:rPr><w:t xml:space="preserve">- Khả năng kéo cáp quang: {{FIBER_CAPABILITY}} </w:t></w:r><w:r><w:rPr><w:rFonts w:ascii="Segoe UI Symbol" w:hAnsi="Segoe UI Symbol" w:cs="Segoe UI Symbol"/><w:sz w:val="26"/><w:szCs w:val="26"/></w:rPr><w:t>…………………………………………………………………………………………</w:t></w:r></w:p><w:p><w:pPr><w:spacing w:line="240" w:lineRule="auto"/><w:rPr><w:rFonts w:ascii="Times New Roman" w:hAnsi="Times New Roman" w:cs="Times New Roman"/><w:sz w:val="26"/><w:szCs w:val="26"/></w:rPr></w:pPr><w:r><w:rPr><w:rFonts w:ascii="Times New Roman" w:hAnsi="Times New Roman" w:cs="Times New Roman"/><w:sz w:val="26"/><w:szCs w:val="26"/></w:rPr><w:t xml:space="preserve">- </w:t></w:r><w:r><w:rPr><w:rFonts w:ascii="Times New Roman" w:hAnsi="Times New Roman" w:cs="Times New Roman"/><w:sz w:val="26"/><w:szCs w:val="26"/></w:rPr><w:t xml:space="preserve">Pháp lý đất/nhà: </w:t></w:r><w:r><w:rPr><w:rFonts w:ascii="Segoe UI Symbol" w:hAnsi="Segoe UI Symbol" w:cs="Segoe UI Symbol"/><w:sz w:val="26"/><w:szCs w:val="26"/></w:rPr><w:t>{{#LEGAL_RED_BOOK}}☑{{/LEGAL_RED_BOOK}}{{^LEGAL_RED_BOOK}}☐{{/LEGAL_RED_BOOK}} Giấy chứng nhận QSD nhà/ đất<w:r><w:rPr><w:rFonts w:ascii="Segoe UI Symbol" w:hAnsi="Segoe UI Symbol" w:cs="Segoe UI Symbol"/><w:sz w:val="26"/><w:szCs w:val="26"/></w:rPr><w:t>{{#LEGAL_OTHER}}☑{{/LEGAL_OTHER}}{{^LEGAL_OTHER}}☐{{/LEGAL_OTHER}} Khác: {{LEGAL_OTHER_DESC}}…………………………</w:t></w:r><w:r><w:rPr><w:rFonts w:ascii="Times New Roman" w:hAnsi="Times New Roman" w:cs="Times New Roman"/><w:sz w:val="26"/><w:szCs w:val="26"/></w:rPr><w:t>.</w:t></w:r></w:p><w:p><w:pPr><w:spacing w:line="240" w:lineRule="auto"/><w:rPr><w:rFonts w:ascii="Times New Roman" w:hAnsi="Times New Roman" w:cs="Times New Roman"/><w:sz w:val="26"/><w:szCs w:val="26"/></w:rPr></w:pPr><w:r><w:rPr><w:rFonts w:ascii="Times New Roman" w:hAnsi="Times New Roman" w:cs="Times New Roman"/><w:sz w:val="26"/><w:szCs w:val="26"/></w:rPr><w:t xml:space="preserve">- Dạng trạm dự kiến: </w:t></w:r><w:r><w:rPr><w:rFonts w:ascii="Times New Roman" w:hAnsi="Times New Roman" w:cs="Times New Roman"/><w:sz w:val="26"/><w:szCs w:val="26"/></w:rPr><w:tab/></w:r><w:r><w:rPr><w:rFonts w:ascii="Segoe UI Symbol" w:hAnsi="Segoe UI Symbol" w:cs="Segoe UI Symbol"/><w:sz w:val="26"/><w:szCs w:val="26"/></w:rPr><w:t>{{#ANTENNA_GUYED}}☑{{/ANTENNA_GUYED}}{{^ANTENNA_GUYED}}☐{{/ANTENNA_GUYED}} Dây co mặt đất<w:r><w:rPr><w:rFonts w:ascii="Times New Roman" w:hAnsi="Times New Roman" w:cs="Times New Roman"/><w:sz w:val="26"/><w:szCs w:val="26"/></w:rPr><w:tab/></w:r><w:r><w:rPr><w:rFonts w:ascii="Segoe UI Symbol" w:hAnsi="Segoe UI Symbol" w:cs="Segoe UI Symbol"/><w:sz w:val="26"/><w:szCs w:val="26"/></w:rPr><w:t>{{#ANTENNA_MONOPOLE}}☑{{/ANTENNA_MONOPOLE}}{{^ANTENNA_MONOPOLE}}☐{{/ANTENNA_MONOPOLE}} Cột monopole mặt đất</w:rPr></w:pPr><w:r><w:rPr><w:rFonts w:ascii="Segoe UI Symbol" w:hAnsi="Segoe UI Symbol" w:cs="Segoe UI Symbol"/><w:sz w:val="26"/><w:szCs w:val="26"/></w:rPr><w:t xml:space="preserve"> </w:t></w:r><w:r><w:rPr><w:rFonts w:ascii="Times New Roman" w:hAnsi="Times New Roman" w:cs="Times New Roman"/><w:sz w:val="26"/><w:szCs w:val="26"/></w:rPr><w:t xml:space="preserve">- Chiều cao cột anten dự kiến: </w:t></w:r><w:r><w:rPr><w:rFonts w:ascii="Segoe UI Symbol" w:hAnsi="Segoe UI Symbol" w:cs="Segoe UI Symbol"/><w:sz w:val="26"/><w:szCs w:val="26"/></w:rPr><w:t>{{#HEIGHT_30}}☑{{/HEIGHT_30}}{{^HEIGHT_30}}☐{{/HEIGHT_30}} 30m<w:r><w:rPr><w:rFonts w:ascii="Segoe UI Symbol" w:hAnsi="Segoe UI Symbol" w:cs="Segoe UI Symbol"/><w:sz w:val="26"/><w:szCs w:val="26"/></w:rPr><w:t>{{#HEIGHT_36}}☑{{/HEIGHT_36}}{{^HEIGHT_36}}☐{{/HEIGHT_36}} 36m<w:r><w:rPr><w:rFonts w:ascii="Segoe UI Symbol" w:hAnsi="Segoe UI Symbol" w:cs="Segoe UI Symbol"/><w:sz w:val="26"/><w:szCs w:val="26"/></w:rPr><w:t>{{#HEIGHT_42}}☑{{/HEIGHT_42}}{{^HEIGHT_42}}☐{{/HEIGHT_42}} 42m<w:r><w:rPr><w:rFonts w:ascii="Segoe UI Symbol" w:hAnsi="Segoe UI Symbol" w:cs="Segoe UI Symbol"/><w:sz w:val="26"/><w:szCs w:val="26"/></w:rPr><w:t>{{#HEIGHT_OTHER}}☑{{/HEIGHT_OTHER}}{{^HEIGHT_OTHER}}☐{{/HEIGHT_OTHER}} Khác: {{HEIGHT_OTHER_DESC}} ……</w:t></w:r><w:r><w:rPr><w:rFonts w:ascii="Times New Roman" w:hAnsi="Times New Roman" w:cs="Times New Roman"/><w:sz w:val="26"/><w:szCs w:val="26"/></w:rPr><w:t>………</w:t></w:r></w:p><w:p><w:pPr><w:spacing w:line="240" w:lineRule="auto"/><w:rPr><w:rFonts w:ascii="Times New Roman" w:hAnsi="Times New Roman" w:cs="Times New Roman"/><w:sz w:val="26"/><w:szCs w:val="26"/></w:rPr></w:pPr><w:r><w:rPr><w:rFonts w:ascii="Times New Roman" w:hAnsi="Times New Roman" w:cs="Times New Roman"/><w:sz w:val="26"/><w:szCs w:val="26"/></w:rPr><w:t xml:space="preserve">- Loại móng cột dây co dự kiến: </w:t></w:r><w:r><w:rPr><w:rFonts w:ascii="Segoe UI Symbol" w:hAnsi="Segoe UI Symbol" w:cs="Segoe UI Symbol"/><w:sz w:val="26"/><w:szCs w:val="26"/></w:rPr><w:t>{{#FOUNDATION_3}}☑{{/FOUNDATION_3}}{{^FOUNDATION_3}}☐{{/FOUNDATION_3}} 3 co </w:t></w:r><w:r><w:rPr><w:rFonts w:ascii="Times New Roman" w:hAnsi="Times New Roman" w:cs="Times New Roman"/><w:sz w:val="26"/><w:szCs w:val="26"/></w:rPr><w:tab/></w:r><w:r><w:rPr><w:rFonts w:ascii="Times New Roman" w:hAnsi="Times New Roman" w:cs="Times New Roman"/><w:sz w:val="26"/><w:szCs w:val="26"/></w:rPr><w:tab/></w:r><w:r><w:rPr><w:rFonts w:ascii="Segoe UI Symbol" w:hAnsi="Segoe UI Symbol" w:cs="Segoe UI Symbol"/><w:sz w:val="26"/><w:szCs w:val="26"/></w:rPr><w:t>{{#FOUNDATION_4}}☑{{/FOUNDATION_4}}{{^FOUNDATION_4}}☐{{/FOUNDATION_4}} 4 co</w:rPr></w:pPr><w:r><w:rPr><w:rFonts w:ascii="Times New Roman" w:hAnsi="Times New Roman" w:cs="Times New Roman"/><w:sz w:val="26"/><w:szCs w:val="26"/></w:rPr><w:t>- Các công trình, vật dụng, cây cối có khả năng xung đột: {{CONFLICT_NOTES}} khi xây dựng trạm BTS/cột anten/móng cột (số lượng/loại</w:t></w:r><w:r><w:rPr><w:rFonts w:ascii="Times New Roman" w:hAnsi="Times New Roman" w:cs="Times New Roman"/><w:sz w:val="26"/><w:szCs w:val="26"/></w:rPr><w:t xml:space="preserve"> và trách nhiệm thực hiện</w:t></w:r><w:r><w:rPr><w:rFonts w:ascii="Times New Roman" w:hAnsi="Times New Roman" w:cs="Times New Roman"/><w:sz w:val="26"/><w:szCs w:val="26"/></w:rPr><w:t>):</w:t></w:r><w:r><w:rPr><w:rFonts w:ascii="Times New Roman" w:hAnsi="Times New Roman" w:cs="Times New Roman"/><w:sz w:val="26"/><w:szCs w:val="26"/></w:rPr><w:t xml:space="preserve"> </w:t></w:r><w:r><w:rPr><w:rFonts w:ascii="Times New Roman" w:hAnsi="Times New Roman" w:cs="Times New Roman"/><w:sz w:val="26"/><w:szCs w:val="26"/></w:rPr><w:t>……</w:t></w:r><w:r><w:rPr><w:rFonts w:ascii="Times New Roman" w:hAnsi="Times New Roman" w:cs="Times New Roman"/><w:sz w:val="26"/><w:szCs w:val="26"/></w:rPr><w:t>…………….</w:t></w:r><w:r><w:rPr><w:rFonts w:ascii="Times New Roman" w:hAnsi="Times New Roman" w:cs="Times New Roman"/><w:sz w:val="26"/><w:szCs w:val="26"/></w:rPr><w:t>…</w:t></w:r><w:r><w:rPr><w:rFonts w:ascii="Times New Roman" w:hAnsi="Times New Roman" w:cs="Times New Roman"/><w:sz w:val="26"/><w:szCs w:val="26"/></w:rPr><w:t>…………………………………………………………………………………………………………………………………………………</w:t></w:r><w:r><w:rPr><w:rFonts w:ascii="Times New Roman" w:hAnsi="Times New Roman" w:cs="Times New Roman"/><w:sz w:val="26"/><w:szCs w:val="26"/></w:rPr><w:t>………………….</w:t></w:r></w:p><w:p><w:pPr><w:spacing w:line="240" w:lineRule="auto"/><w:rPr><w:rFonts w:ascii="Times New Roman" w:hAnsi="Times New Roman" w:cs="Times New Roman"/><w:sz w:val="26"/><w:szCs w:val="26"/></w:rPr></w:pPr><w:r><w:rPr><w:rFonts w:ascii="Times New Roman" w:hAnsi="Times New Roman" w:cs="Times New Roman"/><w:sz w:val="26"/><w:szCs w:val="26"/></w:rPr><w:t xml:space="preserve">- </w:t></w:r><w:r><w:rPr><w:rFonts w:ascii="Times New Roman" w:hAnsi="Times New Roman" w:cs="Times New Roman"/><w:sz w:val="26"/><w:szCs w:val="26"/></w:rPr><w:t>Ý kiến</w:t></w:r><w:r><w:rPr><w:rFonts w:ascii="Times New Roman" w:hAnsi="Times New Roman" w:cs="Times New Roman"/><w:sz w:val="26"/><w:szCs w:val="26"/></w:rPr><w:t xml:space="preserve"> khác: .....................................................</w:t></w:r><w:r><w:rPr><w:rFonts w:ascii="Times New Roman" w:hAnsi="Times New Roman" w:cs="Times New Roman"/><w:sz w:val="26"/><w:szCs w:val="26"/></w:rPr><w:t>................................................................</w:t></w:r></w:p><w:p><w:pPr><w:spacing w:line="240" w:lineRule="auto"/><w:rPr><w:rFonts w:ascii="Times New Roman" w:hAnsi="Times New Roman" w:cs="Times New Roman"/><w:sz w:val="26"/><w:szCs w:val="26"/></w:rPr></w:pPr><w:r><w:rPr><w:rFonts w:ascii="Times New Roman" w:hAnsi="Times New Roman" w:cs="Times New Roman"/><w:sz w:val="26"/><w:szCs w:val="26"/></w:rPr><w:t>- Ảnh chụp hiện trạng, vẽ sơ bộ mặt bằng khu đất và bố trí dự kiến theo phụ lục đính kèm.</w:t></w:r></w:p><w:p><w:pPr><w:spacing w:line="240" w:lineRule="auto"/><w:rPr><w:rFonts w:ascii="Times New Roman" w:hAnsi="Times New Roman" w:cs="Times New Roman"/><w:b/><w:bCs/><w:sz w:val="26"/><w:szCs w:val="26"/></w:rPr></w:pPr><w:r><w:rPr><w:rFonts w:ascii="Times New Roman" w:hAnsi="Times New Roman" w:cs="Times New Roman"/><w:b/><w:bCs/><w:sz w:val="26"/><w:szCs w:val="26"/></w:rPr><w:t xml:space="preserve">V. </w:t></w:r><w:r><w:rPr><w:rFonts w:ascii="Times New Roman" w:hAnsi="Times New Roman" w:cs="Times New Roman"/><w:b/><w:bCs/><w:sz w:val="26"/><w:szCs w:val="26"/></w:rPr><w:t xml:space="preserve">THỜI GIAN THUÊ, </w:t></w:r><w:r><w:rPr><w:rFonts w:ascii="Times New Roman" w:hAnsi="Times New Roman" w:cs="Times New Roman"/><w:b/><w:bCs/><w:sz w:val="26"/><w:szCs w:val="26"/></w:rPr><w:t>GIÁ THUÊ VÀ PHƯƠNG THỨC THANH TOÁN</w:t></w:r></w:p><w:p><w:pPr><w:pStyle w:val="ListParagraph"/><w:numPr><w:ilvl w:val="0"/><w:numId w:val="14"/></w:numPr><w:tabs><w:tab w:val="center" w:pos="4222"/><w:tab w:val="left" w:pos="6521"/></w:tabs><w:rPr><w:rFonts w:ascii="Times New Roman" w:hAnsi="Times New Roman" w:cs="Times New Roman"/><w:bCs/><w:sz w:val="26"/><w:szCs w:val="26"/></w:rPr></w:pPr><w:r><w:rPr><w:rFonts w:ascii="Times New Roman" w:hAnsi="Times New Roman" w:cs="Times New Roman"/><w:bCs/><w:sz w:val="26"/><w:szCs w:val="26"/></w:rPr><w:t>Thời gian thuê: {{LEASE_TERM}} năm.………</w:t></w:r><w:r><w:rPr><w:rFonts w:ascii="Times New Roman" w:hAnsi="Times New Roman" w:cs="Times New Roman"/><w:bCs/><w:sz w:val="26"/><w:szCs w:val="26"/></w:rPr><w:t xml:space="preserve"> năm.</w:t></w:r></w:p><w:p><w:pPr><w:pStyle w:val="ListParagraph"/><w:numPr><w:ilvl w:val="0"/><w:numId w:val="14"/></w:numPr><w:tabs><w:tab w:val="center" w:pos="4222"/></w:tabs><w:rPr><w:rFonts w:ascii="Times New Roman" w:hAnsi="Times New Roman" w:cs="Times New Roman"/><w:bCs/><w:i/><w:iCs/><w:sz w:val="26"/><w:szCs w:val="26"/></w:rPr></w:pPr><w:r><w:rPr><w:rFonts w:ascii="Times New Roman" w:hAnsi="Times New Roman" w:cs="Times New Roman"/><w:bCs/><w:sz w:val="26"/><w:szCs w:val="26"/></w:rPr><w:t>Giá thuê: {{RENT_FEE}} đồng/tháng.………………………</w:t></w:r><w:r><w:rPr><w:rFonts w:ascii="Times New Roman" w:hAnsi="Times New Roman" w:cs="Times New Roman"/><w:bCs/><w:sz w:val="26"/><w:szCs w:val="26"/></w:rPr><w:t xml:space="preserve"> </w:t></w:r><w:r><w:rPr><w:rFonts w:ascii="Times New Roman" w:hAnsi="Times New Roman" w:cs="Times New Roman"/><w:bCs/><w:sz w:val="26"/><w:szCs w:val="26"/></w:rPr><w:t>đồng / tháng.</w:t></w:r></w:p><w:p><w:pPr><w:pStyle w:val="ListParagraph"/><w:tabs><w:tab w:val="center" w:pos="4222"/></w:tabs><w:rPr><w:rFonts w:ascii="Times New Roman" w:hAnsi="Times New Roman" w:cs="Times New Roman"/><w:bCs/><w:i/><w:iCs/><w:sz w:val="26"/><w:szCs w:val="26"/></w:rPr></w:pPr><w:r><w:rPr><w:rFonts w:ascii="Times New Roman" w:hAnsi="Times New Roman" w:cs="Times New Roman"/><w:bCs/><w:i/><w:iCs/><w:sz w:val="26"/><w:szCs w:val="26"/></w:rPr><w:t>(</w:t></w:r><w:r><w:rPr><w:rFonts w:ascii="Times New Roman" w:hAnsi="Times New Roman" w:cs="Times New Roman"/><w:bCs/><w:i/><w:iCs/><w:sz w:val="26"/><w:szCs w:val="26"/></w:rPr><w:tab/><w:t>Bằng chữ: {{RENT_FEE_TEXT}}………………………………………………………………………)</w:t></w:r></w:p><w:p><w:pPr><w:pStyle w:val="ListParagraph"/><w:numPr><w:ilvl w:val="0"/><w:numId w:val="13"/></w:numPr><w:tabs><w:tab w:val="center" w:pos="4222"/></w:tabs><w:ind w:left="1134"/><w:rPr><w:rFonts w:ascii="Times New Roman" w:hAnsi="Times New Roman" w:cs="Times New Roman"/><w:bCs/><w:sz w:val="26"/><w:szCs w:val="26"/></w:rPr></w:pPr><w:r><w:rPr><w:rFonts w:ascii="Times New Roman" w:hAnsi="Times New Roman" w:cs="Times New Roman"/><w:bCs/><w:sz w:val="26"/><w:szCs w:val="26"/></w:rPr><w:t>Giá thuê bao gồm các loại thuế do Nhà Nước quy định.</w:t></w:r></w:p><w:p><w:pPr><w:pStyle w:val="ListParagraph"/><w:numPr><w:ilvl w:val="0"/><w:numId w:val="13"/></w:numPr><w:tabs><w:tab w:val="center" w:pos="4222"/></w:tabs><w:ind w:left="1134"/><w:rPr><w:rFonts w:ascii="Times New Roman" w:hAnsi="Times New Roman" w:cs="Times New Roman"/><w:bCs/><w:sz w:val="26"/><w:szCs w:val="26"/></w:rPr></w:pPr><w:r><w:rPr><w:rFonts w:ascii="Times New Roman" w:hAnsi="Times New Roman" w:cs="Times New Roman"/><w:bCs/><w:sz w:val="26"/><w:szCs w:val="26"/></w:rPr><w:t>Giá thuê không thay đổi suốt thời gian thuê.</w:t></w:r></w:p><w:p><w:pPr><w:pStyle w:val="ListParagraph"/><w:numPr><w:ilvl w:val="0"/><w:numId w:val="13"/></w:numPr><w:tabs><w:tab w:val="center" w:pos="4222"/></w:tabs><w:ind w:left="1134"/><w:rPr><w:rFonts w:ascii="Times New Roman" w:hAnsi="Times New Roman" w:cs="Times New Roman"/><w:bCs/><w:sz w:val="26"/><w:szCs w:val="26"/></w:rPr></w:pPr><w:r><w:rPr><w:rFonts w:ascii="Times New Roman" w:hAnsi="Times New Roman" w:cs="Times New Roman"/><w:bCs/><w:sz w:val="26"/><w:szCs w:val="26"/></w:rPr><w:t xml:space="preserve">Thanh toán </w:t></w:r><w:r><w:rPr><w:rFonts w:ascii="Times New Roman" w:hAnsi="Times New Roman" w:cs="Times New Roman"/><w:bCs/><w:sz w:val="26"/><w:szCs w:val="26"/></w:rPr><w:t xml:space="preserve">đầu kỳ </w:t></w:r><w:r><w:rPr><w:rFonts w:ascii="Times New Roman" w:hAnsi="Times New Roman" w:cs="Times New Roman"/><w:bCs/><w:sz w:val="26"/><w:szCs w:val="26"/></w:rPr><w:t>06 tháng 01 lần.</w:t></w:r></w:p><w:p><w:pPr><w:pStyle w:val="ListParagraph"/><w:numPr><w:ilvl w:val="0"/><w:numId w:val="14"/></w:numPr><w:tabs><w:tab w:val="center" w:pos="4222"/></w:tabs><w:jc w:val="both"/><w:rPr><w:rFonts w:ascii="Times New Roman" w:hAnsi="Times New Roman" w:cs="Times New Roman"/><w:bCs/><w:sz w:val="26"/><w:szCs w:val="26"/></w:rPr></w:pPr><w:r><w:rPr><w:rFonts w:ascii="Times New Roman" w:hAnsi="Times New Roman" w:cs="Times New Roman"/><w:bCs/><w:sz w:val="26"/><w:szCs w:val="26"/></w:rPr><w:t xml:space="preserve">Thời điểm bắt đầu tính tiền: </w:t></w:r><w:r><w:rPr><w:rFonts w:ascii="Times New Roman" w:hAnsi="Times New Roman" w:cs="Times New Roman"/><w:bCs/><w:sz w:val="26"/><w:szCs w:val="26"/></w:rPr><w:t>Kể từ ngày bên A lắp đặt thiết bị phát sóng trạm.</w:t></w:r></w:p><w:p><w:pPr><w:tabs><w:tab w:val="left" w:pos="709"/><w:tab w:val="center" w:pos="4222"/></w:tabs><w:spacing w:after="0" w:line="240" w:lineRule="auto"/><w:jc w:val="both"/><w:rPr><w:rFonts w:ascii="Times New Roman" w:hAnsi="Times New Roman" w:cs="Times New Roman"/><w:bCs/><w:sz w:val="26"/><w:szCs w:val="26"/></w:rPr></w:pPr><w:r><w:rPr><w:rFonts w:ascii="Times New Roman" w:hAnsi="Times New Roman" w:cs="Times New Roman"/><w:bCs/><w:sz w:val="26"/><w:szCs w:val="26"/></w:rPr><w:t xml:space="preserve">Biên bản ghi nhớ này chính là cơ sở để </w:t></w:r><w:r><w:rPr><w:rFonts w:ascii="Times New Roman" w:hAnsi="Times New Roman" w:cs="Times New Roman"/><w:bCs/><w:sz w:val="26"/><w:szCs w:val="26"/></w:rPr><w:t xml:space="preserve">tiến hành </w:t></w:r><w:r><w:rPr><w:rFonts w:ascii="Times New Roman" w:hAnsi="Times New Roman" w:cs="Times New Roman"/><w:bCs/><w:sz w:val="26"/><w:szCs w:val="26"/></w:rPr><w:t>ký kết hợp đồng giữa hai bên.</w:t></w:r></w:p><w:p><w:pPr><w:spacing w:line="240" w:lineRule="auto"/><w:rPr><w:rFonts w:ascii="Times New Roman" w:hAnsi="Times New Roman" w:cs="Times New Roman"/><w:sz w:val="26"/><w:szCs w:val="26"/></w:rPr></w:pPr><w:r><w:rPr><w:rFonts w:ascii="Times New Roman" w:hAnsi="Times New Roman" w:cs="Times New Roman"/><w:sz w:val="26"/><w:szCs w:val="26"/></w:rPr><w:t>Biên bản lập thành 02 bản, mỗi bên giữ 01 bản.</w:t></w:r></w:p><w:tbl><w:tblPr><w:tblStyle w:val="TableGrid"/><w:tblW w:w="0" w:type="auto"/><w:tblBorders><w:top w:val="none" w:sz="0" w:space="0" w:color="auto"/><w:left w:val="none" w:sz="0" w:space="0" w:color="auto"/><w:bottom w:val="none" w:sz="0" w:space="0" w:color="auto"/><w:right w:val="none" w:sz="0" w:space="0" w:color="auto"/><w:insideH w:val="none" w:sz="0" w:space="0" w:color="auto"/><w:insideV w:val="none" w:sz="0" w:space="0" w:color="auto"/></w:tblBorders><w:tblLook w:val="04A0" w:firstRow="1" w:lastRow="0" w:firstColumn="1" w:lastColumn="0" w:noHBand="0" w:noVBand="1"/></w:tblPr><w:tblGrid><w:gridCol w:w="4696"/><w:gridCol w:w="4709"/></w:tblGrid><w:tr><w:tc><w:tcPr><w:tcW w:w="4810" w:type="dxa"/></w:tcPr><w:p><w:pPr><w:jc w:val="center"/><w:rPr><w:rFonts w:ascii="Times New Roman" w:hAnsi="Times New Roman" w:cs="Times New Roman"/><w:b/><w:bCs/><w:sz w:val="26"/><w:szCs w:val="26"/></w:rPr></w:pPr><w:r><w:rPr><w:rFonts w:ascii="Times New Roman" w:hAnsi="Times New Roman" w:cs="Times New Roman"/><w:b/><w:bCs/><w:sz w:val="26"/><w:szCs w:val="26"/></w:rPr><w:t xml:space="preserve">ĐẠI DIỆN </w:t></w:r><w:r><w:rPr><w:rFonts w:ascii="Times New Roman" w:hAnsi="Times New Roman" w:cs="Times New Roman"/><w:b/><w:bCs/><w:sz w:val="26"/><w:szCs w:val="26"/></w:rPr><w:t>MBF ĐỒNG NAI</w:t></w:r></w:p><w:p><w:pPr><w:jc w:val="center"/><w:rPr><w:rFonts w:ascii="Times New Roman" w:hAnsi="Times New Roman" w:cs="Times New Roman"/><w:sz w:val="26"/><w:szCs w:val="26"/></w:rPr></w:pPr><w:r><w:rPr><w:rFonts w:ascii="Times New Roman" w:hAnsi="Times New Roman" w:cs="Times New Roman"/><w:sz w:val="26"/><w:szCs w:val="26"/></w:rPr><w:t>Người khảo sát          N</w:t></w:r><w:r><w:rPr><w:rFonts w:ascii="Times New Roman" w:hAnsi="Times New Roman" w:cs="Times New Roman"/><w:sz w:val="26"/><w:szCs w:val="26"/></w:rPr><w:t>g</w:t></w:r><w:r><w:rPr><w:rFonts w:ascii="Times New Roman" w:hAnsi="Times New Roman" w:cs="Times New Roman"/><w:sz w:val="26"/><w:szCs w:val="26"/></w:rPr><w:t>ười kiểm tra</w:t></w:r></w:p></w:tc><w:tc><w:tcPr><w:tcW w:w="4811" w:type="dxa"/></w:tcPr><w:p><w:pPr><w:jc w:val="center"/><w:rPr><w:rFonts w:ascii="Times New Roman" w:hAnsi="Times New Roman" w:cs="Times New Roman"/><w:b/><w:bCs/><w:sz w:val="26"/><w:szCs w:val="26"/></w:rPr></w:pPr><w:r><w:rPr><w:rFonts w:ascii="Times New Roman" w:hAnsi="Times New Roman" w:cs="Times New Roman"/><w:b/><w:bCs/><w:sz w:val="26"/><w:szCs w:val="26"/></w:rPr><w:t>CHỦ ĐẤT/CHỦ NHÀ</w:t></w:r></w:p><w:p><w:pPr><w:jc w:val="center"/><w:rPr><w:rFonts w:ascii="Times New Roman" w:hAnsi="Times New Roman" w:cs="Times New Roman"/><w:b/><w:bCs/><w:sz w:val="26"/><w:szCs w:val="26"/></w:rPr></w:pPr><w:r><w:rPr><w:rFonts w:ascii="Times New Roman" w:hAnsi="Times New Roman" w:cs="Times New Roman"/><w:sz w:val="26"/><w:szCs w:val="26"/></w:rPr><w:t>(Ký, ghi rõ họ tên)</w:t></w:r></w:p></w:tc></w:tr></w:tbl><w:p><w:pPr><w:rPr><w:rFonts w:ascii="Times New Roman" w:hAnsi="Times New Roman" w:cs="Times New Roman"/><w:b/><w:bCs/><w:sz w:val="26"/><w:szCs w:val="26"/></w:rPr></w:pPr><w:bookmarkStart w:id="0" w:name="_GoBack"/><w:bookmarkEnd w:id="0"/></w:p><w:sectPr><w:pgSz w:w="12240" w:h="15840"/><w:pgMar w:top="990" w:right="1134" w:bottom="1134" w:left="1701" w:header="720" w:footer="720" w:gutter="0"/><w:cols w:space="720"/><w:docGrid w:linePitch="360"/></w:sectPr></w:body></w:document>
+<file path=word/document.xml><?xml version="1.0" encoding="utf-8"?>
+<w:document xmlns:wpc="http://schemas.microsoft.com/office/word/2010/wordprocessingCanvas" xmlns:cx="http://schemas.microsoft.com/office/drawing/2014/chartex" xmlns:cx1="http://schemas.microsoft.com/office/drawing/2015/9/8/chartex" xmlns:cx2="http://schemas.microsoft.com/office/drawing/2015/10/21/chartex" xmlns:cx3="http://schemas.microsoft.com/office/drawing/2016/5/9/chartex" xmlns:cx4="http://schemas.microsoft.com/office/drawing/2016/5/10/chartex" xmlns:cx5="http://schemas.microsoft.com/office/drawing/2016/5/11/chartex" xmlns:cx6="http://schemas.microsoft.com/office/drawing/2016/5/12/chartex" xmlns:cx7="http://schemas.microsoft.com/office/drawing/2016/5/13/chartex" xmlns:cx8="http://schemas.microsoft.com/office/drawing/2016/5/14/chartex" xmlns:mc="http://schemas.openxmlformats.org/markup-compatibility/2006" xmlns:aink="http://schemas.microsoft.com/office/drawing/2016/ink" xmlns:am3d="http://schemas.microsoft.com/office/drawing/2017/model3d" xmlns:o="urn:schemas-microsoft-com:office:office" xmlns:r="http://schemas.openxmlformats.org/officeDocument/2006/relationships" xmlns:m="http://schemas.openxmlformats.org/officeDocument/2006/math" xmlns:v="urn:schemas-microsoft-com:vml" xmlns:wp14="http://schemas.microsoft.com/office/word/2010/wordprocessingDrawing" xmlns:wp="http://schemas.openxmlformats.org/drawingml/2006/wordprocessingDrawing" xmlns:w10="urn:schemas-microsoft-com:office:word" xmlns:w="http://schemas.openxmlformats.org/wordprocessingml/2006/main" xmlns:w14="http://schemas.microsoft.com/office/word/2010/wordml" xmlns:w15="http://schemas.microsoft.com/office/word/2012/wordml" xmlns:w16cid="http://schemas.microsoft.com/office/word/2016/wordml/cid" xmlns:w16se="http://schemas.microsoft.com/office/word/2015/wordml/symex" xmlns:wpg="http://schemas.microsoft.com/office/word/2010/wordprocessingGroup" xmlns:wpi="http://schemas.microsoft.com/office/word/2010/wordprocessingInk" xmlns:wne="http://schemas.microsoft.com/office/word/2006/wordml" xmlns:wps="http://schemas.microsoft.com/office/word/2010/wordprocessingShape" mc:Ignorable="w14 w15 w16se w16cid wp14">
+  <w:body>
+    <w:tbl>
+      <w:tblPr>
+        <w:tblW w:w="9356" w:type="dxa"/>
+        <w:jc w:val="center"/>
+        <w:tblLook w:val="01E0" w:firstRow="1" w:lastRow="1" w:firstColumn="1" w:lastColumn="1" w:noHBand="0" w:noVBand="0"/>
+      </w:tblPr>
+      <w:tblGrid>
+        <w:gridCol w:w="9356"/>
+      </w:tblGrid>
+      <w:tr>
+        <w:trPr>
+          <w:jc w:val="center"/>
+        </w:trPr>
+        <w:tc>
+          <w:tcPr>
+            <w:tcW w:w="9356" w:type="dxa"/>
+          </w:tcPr>
+          <w:p>
+            <w:pPr>
+              <w:spacing w:line="240" w:lineRule="auto"/>
+              <w:jc w:val="center"/>
+              <w:rPr>
+                <w:rFonts w:ascii="Times New Roman" w:hAnsi="Times New Roman" w:cs="Times New Roman"/>
+                <w:b/>
+                <w:sz w:val="26"/>
+                <w:szCs w:val="26"/>
+                <w:lang w:val="nl-NL"/>
+              </w:rPr>
+            </w:pPr>
+            <w:r>
+              <w:rPr>
+                <w:rFonts w:ascii="Times New Roman" w:hAnsi="Times New Roman" w:cs="Times New Roman"/>
+                <w:b/>
+                <w:sz w:val="26"/>
+                <w:szCs w:val="26"/>
+                <w:lang w:val="nl-NL"/>
+              </w:rPr>
+              <w:t>CỘNG HÒA XÃ HỘI CHỦ NGHĨA VIỆT NAM</w:t>
+            </w:r>
+          </w:p>
+        </w:tc>
+      </w:tr>
+      <w:tr>
+        <w:trPr>
+          <w:jc w:val="center"/>
+        </w:trPr>
+        <w:tc>
+          <w:tcPr>
+            <w:tcW w:w="9356" w:type="dxa"/>
+          </w:tcPr>
+          <w:p>
+            <w:pPr>
+              <w:spacing w:line="240" w:lineRule="auto"/>
+              <w:jc w:val="center"/>
+              <w:rPr>
+                <w:rFonts w:ascii="Times New Roman" w:hAnsi="Times New Roman" w:cs="Times New Roman"/>
+                <w:b/>
+                <w:sz w:val="26"/>
+                <w:szCs w:val="26"/>
+              </w:rPr>
+            </w:pPr>
+            <w:r>
+              <w:rPr>
+                <w:rFonts w:ascii="Times New Roman" w:hAnsi="Times New Roman" w:cs="Times New Roman"/>
+                <w:noProof/>
+                <w:sz w:val="26"/>
+                <w:szCs w:val="26"/>
+              </w:rPr>
+              <mc:AlternateContent>
+                <mc:Choice Requires="wps">
+                  <w:drawing>
+                    <wp:anchor distT="4294967295" distB="4294967295" distL="114300" distR="114300" simplePos="0" relativeHeight="251659264" behindDoc="0" locked="0" layoutInCell="1" allowOverlap="1" wp14:anchorId="0A5F695E" wp14:editId="0959EC28">
+                      <wp:simplePos x="0" y="0"/>
+                      <wp:positionH relativeFrom="column">
+                        <wp:posOffset>1919605</wp:posOffset>
+                      </wp:positionH>
+                      <wp:positionV relativeFrom="paragraph">
+                        <wp:posOffset>225425</wp:posOffset>
+                      </wp:positionV>
+                      <wp:extent cx="1981200" cy="0"/>
+                      <wp:effectExtent l="0" t="0" r="0" b="0"/>
+                      <wp:wrapNone/>
+                      <wp:docPr id="53" name="Straight Connector 53"/>
+                      <wp:cNvGraphicFramePr>
+                        <a:graphicFrameLocks xmlns:a="http://schemas.openxmlformats.org/drawingml/2006/main"/>
+                      </wp:cNvGraphicFramePr>
+                      <a:graphic xmlns:a="http://schemas.openxmlformats.org/drawingml/2006/main">
+                        <a:graphicData uri="http://schemas.microsoft.com/office/word/2010/wordprocessingShape">
+                          <wps:wsp>
+                            <wps:cNvCnPr>
+                              <a:cxnSpLocks noChangeShapeType="1"/>
+                            </wps:cNvCnPr>
+                            <wps:spPr bwMode="auto">
+                              <a:xfrm>
+                                <a:off x="0" y="0"/>
+                                <a:ext cx="1981200" cy="0"/>
+                              </a:xfrm>
+                              <a:prstGeom prst="line">
+                                <a:avLst/>
+                              </a:prstGeom>
+                              <a:noFill/>
+                              <a:ln w="9525">
+                                <a:solidFill>
+                                  <a:srgbClr val="000000"/>
+                                </a:solidFill>
+                                <a:round/>
+                                <a:headEnd/>
+                                <a:tailEnd/>
+                              </a:ln>
+                              <a:extLst>
+                                <a:ext uri="{909E8E84-426E-40DD-AFC4-6F175D3DCCD1}">
+                                  <a14:hiddenFill xmlns:a14="http://schemas.microsoft.com/office/drawing/2010/main">
+                                    <a:noFill/>
+                                  </a14:hiddenFill>
+                                </a:ext>
+                              </a:extLst>
+                            </wps:spPr>
+                            <wps:bodyPr/>
+                          </wps:wsp>
+                        </a:graphicData>
+                      </a:graphic>
+                      <wp14:sizeRelH relativeFrom="page">
+                        <wp14:pctWidth>0</wp14:pctWidth>
+                      </wp14:sizeRelH>
+                      <wp14:sizeRelV relativeFrom="page">
+                        <wp14:pctHeight>0</wp14:pctHeight>
+                      </wp14:sizeRelV>
+                    </wp:anchor>
+                  </w:drawing>
+                </mc:Choice>
+                <mc:Fallback xmlns:w16sdtfl="http://schemas.microsoft.com/office/word/2024/wordml/sdtformatlock" xmlns:w16sdtdh="http://schemas.microsoft.com/office/word/2020/wordml/sdtdatahash" xmlns:w16du="http://schemas.microsoft.com/office/word/2023/wordml/word16du" xmlns:w16="http://schemas.microsoft.com/office/word/2018/wordml" xmlns:w16cex="http://schemas.microsoft.com/office/word/2018/wordml/cex" xmlns:oel="http://schemas.microsoft.com/office/2019/extlst">
+                  <w:pict>
+                    <v:line w14:anchorId="678861B3" id="Straight Connector 53" o:spid="_x0000_s1026" style="position:absolute;z-index:251659264;visibility:visible;mso-wrap-style:square;mso-width-percent:0;mso-height-percent:0;mso-wrap-distance-left:9pt;mso-wrap-distance-top:-3e-5mm;mso-wrap-distance-right:9pt;mso-wrap-distance-bottom:-3e-5mm;mso-position-horizontal:absolute;mso-position-horizontal-relative:text;mso-position-vertical:absolute;mso-position-vertical-relative:text;mso-width-percent:0;mso-height-percent:0;mso-width-relative:page;mso-height-relative:page" from="151.15pt,17.75pt" to="307.15pt,17.75pt" o:gfxdata="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"/>
+                  </w:pict>
+                </mc:Fallback>
+              </mc:AlternateContent>
+            </w:r>
+            <w:r>
+              <w:rPr>
+                <w:rFonts w:ascii="Times New Roman" w:hAnsi="Times New Roman" w:cs="Times New Roman"/>
+                <w:b/>
+                <w:sz w:val="26"/>
+                <w:szCs w:val="26"/>
+              </w:rPr>
+              <w:t>Độc lập - Tự do - Hạnh phúc</w:t>
+            </w:r>
+          </w:p>
+        </w:tc>
+      </w:tr>
+    </w:tbl>
+    <w:p>
+      <w:pPr>
+        <w:pStyle w:val="Heading1"/>
+        <w:spacing w:before="40" w:line="240" w:lineRule="auto"/>
+        <w:jc w:val="center"/>
+        <w:rPr>
+          <w:rFonts w:ascii="Times New Roman" w:hAnsi="Times New Roman" w:cs="Times New Roman"/>
+          <w:color w:val="auto"/>
+          <w:sz w:val="26"/>
+          <w:szCs w:val="26"/>
+        </w:rPr>
+      </w:pPr>
+    </w:p>
+    <w:p>
+      <w:pPr>
+        <w:pStyle w:val="Heading1"/>
+        <w:spacing w:before="40" w:line="240" w:lineRule="auto"/>
+        <w:jc w:val="center"/>
+        <w:rPr>
+          <w:rFonts w:ascii="Times New Roman" w:hAnsi="Times New Roman" w:cs="Times New Roman"/>
+          <w:color w:val="auto"/>
+          <w:sz w:val="26"/>
+          <w:szCs w:val="26"/>
+        </w:rPr>
+      </w:pPr>
+      <w:r>
+        <w:rPr>
+          <w:rFonts w:ascii="Times New Roman" w:hAnsi="Times New Roman" w:cs="Times New Roman"/>
+          <w:color w:val="auto"/>
+          <w:sz w:val="26"/>
+          <w:szCs w:val="26"/>
+        </w:rPr>
+        <w:t xml:space="preserve">BIÊN BẢN </w:t>
+      </w:r>
+      <w:r>
+        <w:rPr>
+          <w:rFonts w:ascii="Times New Roman" w:hAnsi="Times New Roman" w:cs="Times New Roman"/>
+          <w:color w:val="auto"/>
+          <w:sz w:val="26"/>
+          <w:szCs w:val="26"/>
+        </w:rPr>
+        <w:t>GHI NHỚ</w:t>
+      </w:r>
+    </w:p>
+    <w:p>
+      <w:pPr>
+        <w:pStyle w:val="Heading1"/>
+        <w:spacing w:before="40" w:line="240" w:lineRule="auto"/>
+        <w:jc w:val="center"/>
+        <w:rPr>
+          <w:rFonts w:ascii="Times New Roman" w:hAnsi="Times New Roman" w:cs="Times New Roman"/>
+          <w:color w:val="auto"/>
+          <w:sz w:val="26"/>
+          <w:szCs w:val="26"/>
+        </w:rPr>
+      </w:pPr>
+      <w:r>
+        <w:rPr>
+          <w:rFonts w:ascii="Times New Roman" w:hAnsi="Times New Roman" w:cs="Times New Roman"/>
+          <w:color w:val="auto"/>
+          <w:sz w:val="26"/>
+          <w:szCs w:val="26"/>
+        </w:rPr>
+        <w:t>KHẢO SÁT VỊ TRÍ XÂY DỰNG TRẠM BTS</w:t>
+      </w:r>
+    </w:p>
+    <w:p>
+      <w:pPr>
+        <w:spacing w:line="240" w:lineRule="auto"/>
+        <w:rPr>
+          <w:rFonts w:ascii="Times New Roman" w:hAnsi="Times New Roman" w:cs="Times New Roman"/>
+          <w:b/>
+          <w:bCs/>
+          <w:sz w:val="26"/>
+          <w:szCs w:val="26"/>
+        </w:rPr>
+      </w:pPr>
+    </w:p>
+    <w:p>
+      <w:pPr>
+        <w:pStyle w:val="ListParagraph"/>
+        <w:numPr>
+          <w:ilvl w:val="0"/>
+          <w:numId w:val="11"/>
+        </w:numPr>
+        <w:spacing w:line="240" w:lineRule="auto"/>
+        <w:ind w:left="450" w:hanging="270"/>
+        <w:rPr>
+          <w:rFonts w:ascii="Times New Roman" w:hAnsi="Times New Roman" w:cs="Times New Roman"/>
+          <w:b/>
+          <w:bCs/>
+          <w:sz w:val="26"/>
+          <w:szCs w:val="26"/>
+        </w:rPr>
+      </w:pPr>
+      <w:r>
+        <w:rPr>
+          <w:rFonts w:ascii="Times New Roman" w:hAnsi="Times New Roman" w:cs="Times New Roman"/>
+          <w:b/>
+          <w:bCs/>
+          <w:sz w:val="26"/>
+          <w:szCs w:val="26"/>
+        </w:rPr>
+        <w:t>THÔNG TIN CHUNG</w:t>
+      </w:r>
+    </w:p>
+    <w:tbl>
+      <w:tblPr>
+        <w:tblStyle w:val="TableGrid"/>
+        <w:tblW w:w="10102" w:type="dxa"/>
+        <w:tblInd w:w="-318" w:type="dxa"/>
+        <w:tblLook w:val="04A0" w:firstRow="1" w:lastRow="0" w:firstColumn="1" w:lastColumn="0" w:noHBand="0" w:noVBand="1"/>
+      </w:tblPr>
+      <w:tblGrid>
+        <w:gridCol w:w="2411"/>
+        <w:gridCol w:w="1759"/>
+        <w:gridCol w:w="2427"/>
+        <w:gridCol w:w="3505"/>
+      </w:tblGrid>
+      <w:tr>
+        <w:trPr>
+          <w:trHeight w:val="353"/>
+        </w:trPr>
+        <w:tc>
+          <w:tcPr>
+            <w:tcW w:w="6597" w:type="dxa"/>
+            <w:gridSpan w:val="3"/>
+            <w:vAlign w:val="center"/>
+          </w:tcPr>
+          <w:p>
+            <w:pPr>
+              <w:rPr>
+                <w:rFonts w:ascii="Times New Roman" w:hAnsi="Times New Roman" w:cs="Times New Roman"/>
+                <w:bCs/>
+                <w:sz w:val="26"/>
+                <w:szCs w:val="26"/>
+              </w:rPr>
+            </w:pPr>
+            <w:r>
+              <w:rPr>
+                <w:rFonts w:ascii="Times New Roman" w:hAnsi="Times New Roman" w:cs="Times New Roman"/>
+                <w:bCs/>
+                <w:sz w:val="26"/>
+                <w:szCs w:val="26"/>
+              </w:rPr>
+              <w:t>Tên trạm / ID trạm: {{SITE_ID}} / {{SITE_ID_OLD}}</w:t>
+            </w:r>
+          </w:p>
+        </w:tc>
+        <w:tc>
+          <w:tcPr>
+            <w:tcW w:w="3505" w:type="dxa"/>
+          </w:tcPr>
+          <w:p>
+            <w:pPr>
+              <w:rPr>
+                <w:rFonts w:ascii="Times New Roman" w:hAnsi="Times New Roman" w:cs="Times New Roman"/>
+                <w:bCs/>
+                <w:sz w:val="26"/>
+                <w:szCs w:val="26"/>
+              </w:rPr>
+            </w:pPr>
+            <w:r>
+              <w:rPr>
+                <w:rFonts w:ascii="Times New Roman" w:hAnsi="Times New Roman" w:cs="Times New Roman"/>
+                <w:bCs/>
+                <w:sz w:val="26"/>
+                <w:szCs w:val="26"/>
+              </w:rPr>
+              <w:t>Loại trạm: {{CLASSIFICATION_TYPE}}</w:t>
+            </w:r>
+          </w:p>
+        </w:tc>
+      </w:tr>
+      <w:tr>
+        <w:trPr>
+          <w:trHeight w:val="339"/>
+        </w:trPr>
+        <w:tc>
+          <w:tcPr>
+            <w:tcW w:w="10102" w:type="dxa"/>
+            <w:gridSpan w:val="4"/>
+          </w:tcPr>
+          <w:p>
+            <w:pPr>
+              <w:rPr>
+                <w:rFonts w:ascii="Times New Roman" w:hAnsi="Times New Roman" w:cs="Times New Roman"/>
+                <w:bCs/>
+                <w:sz w:val="26"/>
+                <w:szCs w:val="26"/>
+              </w:rPr>
+            </w:pPr>
+            <w:r>
+              <w:rPr>
+                <w:rFonts w:ascii="Times New Roman" w:hAnsi="Times New Roman" w:cs="Times New Roman"/>
+                <w:bCs/>
+                <w:sz w:val="26"/>
+                <w:szCs w:val="26"/>
+              </w:rPr>
+              <w:t xml:space="preserve">Ngày khảo sát: {{SURVEY_DATE}} </w:t>
+            </w:r>
+          </w:p>
+        </w:tc>
+      </w:tr>
+      <w:tr>
+        <w:trPr>
+          <w:trHeight w:val="339"/>
+        </w:trPr>
+        <w:tc>
+          <w:tcPr>
+            <w:tcW w:w="10102" w:type="dxa"/>
+            <w:gridSpan w:val="4"/>
+          </w:tcPr>
+          <w:p>
+            <w:pPr>
+              <w:rPr>
+                <w:rFonts w:ascii="Times New Roman" w:hAnsi="Times New Roman" w:cs="Times New Roman"/>
+                <w:bCs/>
+                <w:sz w:val="26"/>
+                <w:szCs w:val="26"/>
+              </w:rPr>
+            </w:pPr>
+            <w:r>
+              <w:rPr>
+                <w:rFonts w:ascii="Times New Roman" w:hAnsi="Times New Roman" w:cs="Times New Roman"/>
+                <w:bCs/>
+                <w:sz w:val="26"/>
+                <w:szCs w:val="26"/>
+              </w:rPr>
+              <w:t>Địa chỉ: {{ADDRESS}}</w:t>
+            </w:r>
+          </w:p>
+        </w:tc>
+      </w:tr>
+      <w:tr>
+        <w:trPr>
+          <w:trHeight w:val="353"/>
+        </w:trPr>
+        <w:tc>
+          <w:tcPr>
+            <w:tcW w:w="10102" w:type="dxa"/>
+            <w:gridSpan w:val="4"/>
+          </w:tcPr>
+          <w:p>
+            <w:pPr>
+              <w:rPr>
+                <w:rFonts w:ascii="Times New Roman" w:hAnsi="Times New Roman" w:cs="Times New Roman"/>
+                <w:bCs/>
+                <w:sz w:val="26"/>
+                <w:szCs w:val="26"/>
+              </w:rPr>
+            </w:pPr>
+          </w:p>
+        </w:tc>
+      </w:tr>
+      <w:tr>
+        <w:trPr>
+          <w:trHeight w:val="353"/>
+        </w:trPr>
+        <w:tc>
+          <w:tcPr>
+            <w:tcW w:w="2411" w:type="dxa"/>
+          </w:tcPr>
+          <w:p>
+            <w:pPr>
+              <w:jc w:val="center"/>
+              <w:rPr>
+                <w:rFonts w:ascii="Times New Roman" w:hAnsi="Times New Roman" w:cs="Times New Roman"/>
+                <w:bCs/>
+                <w:sz w:val="26"/>
+                <w:szCs w:val="26"/>
+              </w:rPr>
+            </w:pPr>
+            <w:r>
+              <w:rPr>
+                <w:rFonts w:ascii="Times New Roman" w:hAnsi="Times New Roman" w:cs="Times New Roman"/>
+                <w:bCs/>
+                <w:sz w:val="26"/>
+                <w:szCs w:val="26"/>
+              </w:rPr>
+              <w:t>Tọa độ TK: {{LATITUDE_PLAN}}, {{LONGITUDE_PLAN}}</w:t>
+            </w:r>
+          </w:p>
+        </w:tc>
+        <w:tc>
+          <w:tcPr>
+            <w:tcW w:w="1759" w:type="dxa"/>
+          </w:tcPr>
+          <w:p>
+            <w:pPr>
+              <w:jc w:val="center"/>
+              <w:rPr>
+                <w:rFonts w:ascii="Times New Roman" w:hAnsi="Times New Roman" w:cs="Times New Roman"/>
+                <w:bCs/>
+                <w:sz w:val="26"/>
+                <w:szCs w:val="26"/>
+              </w:rPr>
+            </w:pPr>
+          </w:p>
+        </w:tc>
+        <w:tc>
+          <w:tcPr>
+            <w:tcW w:w="2427" w:type="dxa"/>
+          </w:tcPr>
+          <w:p>
+            <w:pPr>
+              <w:jc w:val="center"/>
+              <w:rPr>
+                <w:rFonts w:ascii="Times New Roman" w:hAnsi="Times New Roman" w:cs="Times New Roman"/>
+                <w:bCs/>
+                <w:sz w:val="26"/>
+                <w:szCs w:val="26"/>
+              </w:rPr>
+            </w:pPr>
+          </w:p>
+        </w:tc>
+        <w:tc>
+          <w:tcPr>
+            <w:tcW w:w="3505" w:type="dxa"/>
+            <w:vMerge w:val="restart"/>
+            <w:vAlign w:val="center"/>
+          </w:tcPr>
+          <w:p>
+            <w:pPr>
+              <w:rPr>
+                <w:rFonts w:ascii="Times New Roman" w:hAnsi="Times New Roman" w:cs="Times New Roman"/>
+                <w:bCs/>
+                <w:sz w:val="26"/>
+                <w:szCs w:val="26"/>
+              </w:rPr>
+            </w:pPr>
+            <w:r>
+              <w:rPr>
+                <w:rFonts w:ascii="Times New Roman" w:hAnsi="Times New Roman" w:cs="Times New Roman"/>
+                <w:bCs/>
+                <w:sz w:val="26"/>
+                <w:szCs w:val="26"/>
+                <w:lang w:val="de-DE"/>
+              </w:rPr>
+              <w:t xml:space="preserve">Sai số (so với TK): {{OFFSET_DISTANCE}}          </w:t>
+            </w:r>
+            <w:r>
+              <w:rPr>
+                <w:rFonts w:ascii="Times New Roman" w:hAnsi="Times New Roman" w:cs="Times New Roman"/>
+                <w:bCs/>
+                <w:sz w:val="26"/>
+                <w:szCs w:val="26"/>
+              </w:rPr>
+              <w:t>(mét)</w:t>
+            </w:r>
+          </w:p>
+        </w:tc>
+      </w:tr>
+      <w:tr>
+        <w:trPr>
+          <w:trHeight w:val="339"/>
+        </w:trPr>
+        <w:tc>
+          <w:tcPr>
+            <w:tcW w:w="2411" w:type="dxa"/>
+            <w:vMerge w:val="restart"/>
+            <w:vAlign w:val="center"/>
+          </w:tcPr>
+          <w:p>
+            <w:pPr>
+              <w:jc w:val="center"/>
+              <w:rPr>
+                <w:rFonts w:ascii="Times New Roman" w:hAnsi="Times New Roman" w:cs="Times New Roman"/>
+                <w:bCs/>
+                <w:sz w:val="26"/>
+                <w:szCs w:val="26"/>
+              </w:rPr>
+            </w:pPr>
+            <w:r>
+              <w:rPr>
+                <w:rFonts w:ascii="Times New Roman" w:hAnsi="Times New Roman" w:cs="Times New Roman"/>
+                <w:bCs/>
+                <w:sz w:val="26"/>
+                <w:szCs w:val="26"/>
+              </w:rPr>
+              <w:t>Tọa độ KS: {{LATITUDE_SURVEY}}, {{LONGITUDE_SURVEY}}</w:t>
+            </w:r>
+          </w:p>
+        </w:tc>
+        <w:tc>
+          <w:tcPr>
+            <w:tcW w:w="1759" w:type="dxa"/>
+          </w:tcPr>
+          <w:p>
+            <w:pPr>
+              <w:jc w:val="center"/>
+              <w:rPr>
+                <w:rFonts w:ascii="Times New Roman" w:hAnsi="Times New Roman" w:cs="Times New Roman"/>
+                <w:bCs/>
+                <w:sz w:val="26"/>
+                <w:szCs w:val="26"/>
+              </w:rPr>
+            </w:pPr>
+          </w:p>
+        </w:tc>
+        <w:tc>
+          <w:tcPr>
+            <w:tcW w:w="2427" w:type="dxa"/>
+          </w:tcPr>
+          <w:p>
+            <w:pPr>
+              <w:jc w:val="center"/>
+              <w:rPr>
+                <w:rFonts w:ascii="Times New Roman" w:hAnsi="Times New Roman" w:cs="Times New Roman"/>
+                <w:bCs/>
+                <w:sz w:val="26"/>
+                <w:szCs w:val="26"/>
+              </w:rPr>
+            </w:pPr>
+          </w:p>
+        </w:tc>
+        <w:tc>
+          <w:tcPr>
+            <w:tcW w:w="3505" w:type="dxa"/>
+            <w:vMerge/>
+          </w:tcPr>
+          <w:p>
+            <w:pPr>
+              <w:jc w:val="center"/>
+              <w:rPr>
+                <w:rFonts w:ascii="Times New Roman" w:hAnsi="Times New Roman" w:cs="Times New Roman"/>
+                <w:bCs/>
+                <w:sz w:val="26"/>
+                <w:szCs w:val="26"/>
+              </w:rPr>
+            </w:pPr>
+          </w:p>
+        </w:tc>
+      </w:tr>
+      <w:tr>
+        <w:trPr>
+          <w:trHeight w:val="169"/>
+        </w:trPr>
+        <w:tc>
+          <w:tcPr>
+            <w:tcW w:w="2411" w:type="dxa"/>
+            <w:vMerge/>
+          </w:tcPr>
+          <w:p>
+            <w:pPr>
+              <w:jc w:val="center"/>
+              <w:rPr>
+                <w:rFonts w:ascii="Times New Roman" w:hAnsi="Times New Roman" w:cs="Times New Roman"/>
+                <w:bCs/>
+                <w:sz w:val="26"/>
+                <w:szCs w:val="26"/>
+              </w:rPr>
+            </w:pPr>
+          </w:p>
+        </w:tc>
+        <w:tc>
+          <w:tcPr>
+            <w:tcW w:w="1759" w:type="dxa"/>
+          </w:tcPr>
+          <w:p>
+            <w:pPr>
+              <w:jc w:val="center"/>
+              <w:rPr>
+                <w:rFonts w:ascii="Times New Roman" w:hAnsi="Times New Roman" w:cs="Times New Roman"/>
+                <w:bCs/>
+                <w:sz w:val="26"/>
+                <w:szCs w:val="26"/>
+              </w:rPr>
+            </w:pPr>
+          </w:p>
+        </w:tc>
+        <w:tc>
+          <w:tcPr>
+            <w:tcW w:w="2427" w:type="dxa"/>
+          </w:tcPr>
+          <w:p>
+            <w:pPr>
+              <w:jc w:val="center"/>
+              <w:rPr>
+                <w:rFonts w:ascii="Times New Roman" w:hAnsi="Times New Roman" w:cs="Times New Roman"/>
+                <w:bCs/>
+                <w:sz w:val="26"/>
+                <w:szCs w:val="26"/>
+              </w:rPr>
+            </w:pPr>
+          </w:p>
+        </w:tc>
+        <w:tc>
+          <w:tcPr>
+            <w:tcW w:w="3505" w:type="dxa"/>
+            <w:vMerge/>
+          </w:tcPr>
+          <w:p>
+            <w:pPr>
+              <w:jc w:val="center"/>
+              <w:rPr>
+                <w:rFonts w:ascii="Times New Roman" w:hAnsi="Times New Roman" w:cs="Times New Roman"/>
+                <w:bCs/>
+                <w:sz w:val="26"/>
+                <w:szCs w:val="26"/>
+              </w:rPr>
+            </w:pPr>
+          </w:p>
+        </w:tc>
+      </w:tr>
+    </w:tbl>
+    <w:p>
+      <w:pPr>
+        <w:spacing w:line="240" w:lineRule="auto"/>
+        <w:rPr>
+          <w:rFonts w:ascii="Times New Roman" w:hAnsi="Times New Roman" w:cs="Times New Roman"/>
+          <w:b/>
+          <w:bCs/>
+          <w:sz w:val="26"/>
+          <w:szCs w:val="26"/>
+        </w:rPr>
+      </w:pPr>
+    </w:p>
+    <w:p>
+      <w:pPr>
+        <w:spacing w:line="240" w:lineRule="auto"/>
+        <w:rPr>
+          <w:rFonts w:ascii="Times New Roman" w:hAnsi="Times New Roman" w:cs="Times New Roman"/>
+          <w:b/>
+          <w:bCs/>
+          <w:sz w:val="26"/>
+          <w:szCs w:val="26"/>
+        </w:rPr>
+      </w:pPr>
+      <w:r>
+        <w:rPr>
+          <w:rFonts w:ascii="Times New Roman" w:hAnsi="Times New Roman" w:cs="Times New Roman"/>
+          <w:b/>
+          <w:bCs/>
+          <w:sz w:val="26"/>
+          <w:szCs w:val="26"/>
+        </w:rPr>
+        <w:t xml:space="preserve">II. </w:t>
+      </w:r>
+      <w:r>
+        <w:rPr>
+          <w:rFonts w:ascii="Times New Roman" w:hAnsi="Times New Roman" w:cs="Times New Roman"/>
+          <w:b/>
+          <w:bCs/>
+          <w:sz w:val="26"/>
+          <w:szCs w:val="26"/>
+        </w:rPr>
+        <w:t>ĐẠI DIỆN CÁC BÊN</w:t>
+      </w:r>
+    </w:p>
+    <w:p>
+      <w:pPr>
+        <w:spacing w:line="240" w:lineRule="auto"/>
+        <w:rPr>
+          <w:rFonts w:ascii="Times New Roman" w:hAnsi="Times New Roman" w:cs="Times New Roman"/>
+          <w:sz w:val="26"/>
+          <w:szCs w:val="26"/>
+        </w:rPr>
+      </w:pPr>
+      <w:r>
+        <w:rPr>
+          <w:rFonts w:ascii="Times New Roman" w:hAnsi="Times New Roman" w:cs="Times New Roman"/>
+          <w:sz w:val="26"/>
+          <w:szCs w:val="26"/>
+        </w:rPr>
+        <w:t xml:space="preserve">1. Đại diện </w:t>
+      </w:r>
+      <w:r>
+        <w:rPr>
+          <w:rFonts w:ascii="Times New Roman" w:hAnsi="Times New Roman" w:cs="Times New Roman"/>
+          <w:sz w:val="26"/>
+          <w:szCs w:val="26"/>
+        </w:rPr>
+        <w:t>MobiFone Đồng Nai</w:t>
+      </w:r>
+      <w:r>
+        <w:rPr>
+          <w:rFonts w:ascii="Times New Roman" w:hAnsi="Times New Roman" w:cs="Times New Roman"/>
+          <w:sz w:val="26"/>
+          <w:szCs w:val="26"/>
+        </w:rPr>
+        <w:t>:</w:t>
+      </w:r>
+    </w:p>
+    <w:p>
+      <w:pPr>
+        <w:spacing w:line="240" w:lineRule="auto"/>
+        <w:rPr>
+          <w:rFonts w:ascii="Times New Roman" w:hAnsi="Times New Roman" w:cs="Times New Roman"/>
+          <w:sz w:val="26"/>
+          <w:szCs w:val="26"/>
+        </w:rPr>
+      </w:pPr>
+      <w:r>
+        <w:rPr>
+          <w:rFonts w:ascii="Times New Roman" w:hAnsi="Times New Roman" w:cs="Times New Roman"/>
+          <w:sz w:val="26"/>
+          <w:szCs w:val="26"/>
+        </w:rPr>
+        <w:t xml:space="preserve">- Người khảo sát: {{SURVEYOR}} ...................</w:t>
+      </w:r>
+      <w:r>
+        <w:rPr>
+          <w:rFonts w:ascii="Times New Roman" w:hAnsi="Times New Roman" w:cs="Times New Roman"/>
+          <w:sz w:val="26"/>
+          <w:szCs w:val="26"/>
+        </w:rPr>
+        <w:t>........</w:t>
+      </w:r>
+      <w:r>
+        <w:rPr>
+          <w:rFonts w:ascii="Times New Roman" w:hAnsi="Times New Roman" w:cs="Times New Roman"/>
+          <w:sz w:val="26"/>
+          <w:szCs w:val="26"/>
+        </w:rPr>
+        <w:t>......</w:t>
+      </w:r>
+      <w:r>
+        <w:rPr>
+          <w:rFonts w:ascii="Times New Roman" w:hAnsi="Times New Roman" w:cs="Times New Roman"/>
+          <w:sz w:val="26"/>
+          <w:szCs w:val="26"/>
+        </w:rPr>
+        <w:t>...</w:t>
+      </w:r>
+      <w:r>
+        <w:rPr>
+          <w:rFonts w:ascii="Times New Roman" w:hAnsi="Times New Roman" w:cs="Times New Roman"/>
+          <w:sz w:val="26"/>
+          <w:szCs w:val="26"/>
+        </w:rPr>
+        <w:t xml:space="preserve"> </w:t>
+      </w:r>
+      <w:r>
+        <w:rPr>
+          <w:rFonts w:ascii="Times New Roman" w:hAnsi="Times New Roman" w:cs="Times New Roman"/>
+          <w:sz w:val="26"/>
+          <w:szCs w:val="26"/>
+        </w:rPr>
+        <w:t>…</w:t>
+      </w:r>
+      <w:r>
+        <w:rPr>
+          <w:rFonts w:ascii="Times New Roman" w:hAnsi="Times New Roman" w:cs="Times New Roman"/>
+          <w:sz w:val="26"/>
+          <w:szCs w:val="26"/>
+        </w:rPr>
+        <w:t>Chức vụ</w:t>
+      </w:r>
+      <w:r>
+        <w:rPr>
+          <w:rFonts w:ascii="Times New Roman" w:hAnsi="Times New Roman" w:cs="Times New Roman"/>
+          <w:sz w:val="26"/>
+          <w:szCs w:val="26"/>
+        </w:rPr>
+        <w:t>: .......................</w:t>
+      </w:r>
+      <w:r>
+        <w:rPr>
+          <w:rFonts w:ascii="Times New Roman" w:hAnsi="Times New Roman" w:cs="Times New Roman"/>
+          <w:sz w:val="26"/>
+          <w:szCs w:val="26"/>
+        </w:rPr>
+        <w:t>........</w:t>
+      </w:r>
+      <w:r>
+        <w:rPr>
+          <w:rFonts w:ascii="Times New Roman" w:hAnsi="Times New Roman" w:cs="Times New Roman"/>
+          <w:sz w:val="26"/>
+          <w:szCs w:val="26"/>
+        </w:rPr>
+        <w:t>..................</w:t>
+      </w:r>
+      <w:r>
+        <w:rPr>
+          <w:rFonts w:ascii="Times New Roman" w:hAnsi="Times New Roman" w:cs="Times New Roman"/>
+          <w:sz w:val="26"/>
+          <w:szCs w:val="26"/>
+        </w:rPr>
+        <w:t>....</w:t>
+      </w:r>
+      <w:r>
+        <w:rPr>
+          <w:rFonts w:ascii="Times New Roman" w:hAnsi="Times New Roman" w:cs="Times New Roman"/>
+          <w:sz w:val="26"/>
+          <w:szCs w:val="26"/>
+        </w:rPr>
+        <w:t>.</w:t>
+      </w:r>
+      <w:r>
+        <w:rPr>
+          <w:rFonts w:ascii="Times New Roman" w:hAnsi="Times New Roman" w:cs="Times New Roman"/>
+          <w:sz w:val="26"/>
+          <w:szCs w:val="26"/>
+        </w:rPr>
+        <w:t>....</w:t>
+      </w:r>
+      <w:r>
+        <w:rPr>
+          <w:rFonts w:ascii="Times New Roman" w:hAnsi="Times New Roman" w:cs="Times New Roman"/>
+          <w:sz w:val="26"/>
+          <w:szCs w:val="26"/>
+        </w:rPr>
+        <w:t>.</w:t>
+      </w:r>
+    </w:p>
+    <w:p>
+      <w:pPr>
+        <w:spacing w:line="240" w:lineRule="auto"/>
+        <w:rPr>
+          <w:rFonts w:ascii="Times New Roman" w:hAnsi="Times New Roman" w:cs="Times New Roman"/>
+          <w:sz w:val="26"/>
+          <w:szCs w:val="26"/>
+        </w:rPr>
+      </w:pPr>
+      <w:r>
+        <w:rPr>
+          <w:rFonts w:ascii="Times New Roman" w:hAnsi="Times New Roman" w:cs="Times New Roman"/>
+          <w:sz w:val="26"/>
+          <w:szCs w:val="26"/>
+        </w:rPr>
+        <w:t xml:space="preserve">- Người kiểm tra: {{CHECKER}} ...............................</w:t>
+      </w:r>
+      <w:r>
+        <w:rPr>
+          <w:rFonts w:ascii="Times New Roman" w:hAnsi="Times New Roman" w:cs="Times New Roman"/>
+          <w:sz w:val="26"/>
+          <w:szCs w:val="26"/>
+        </w:rPr>
+        <w:t>........</w:t>
+      </w:r>
+      <w:r>
+        <w:rPr>
+          <w:rFonts w:ascii="Times New Roman" w:hAnsi="Times New Roman" w:cs="Times New Roman"/>
+          <w:sz w:val="26"/>
+          <w:szCs w:val="26"/>
+        </w:rPr>
+        <w:t>.....</w:t>
+      </w:r>
+      <w:r>
+        <w:rPr>
+          <w:rFonts w:ascii="Times New Roman" w:hAnsi="Times New Roman" w:cs="Times New Roman"/>
+          <w:sz w:val="26"/>
+          <w:szCs w:val="26"/>
+        </w:rPr>
+        <w:t xml:space="preserve">Chức vụ: </w:t>
+      </w:r>
+      <w:r>
+        <w:rPr>
+          <w:rFonts w:ascii="Times New Roman" w:hAnsi="Times New Roman" w:cs="Times New Roman"/>
+          <w:sz w:val="26"/>
+          <w:szCs w:val="26"/>
+        </w:rPr>
+        <w:t>...</w:t>
+      </w:r>
+      <w:r>
+        <w:rPr>
+          <w:rFonts w:ascii="Times New Roman" w:hAnsi="Times New Roman" w:cs="Times New Roman"/>
+          <w:sz w:val="26"/>
+          <w:szCs w:val="26"/>
+        </w:rPr>
+        <w:t>.................</w:t>
+      </w:r>
+      <w:r>
+        <w:rPr>
+          <w:rFonts w:ascii="Times New Roman" w:hAnsi="Times New Roman" w:cs="Times New Roman"/>
+          <w:sz w:val="26"/>
+          <w:szCs w:val="26"/>
+        </w:rPr>
+        <w:t>................................</w:t>
+      </w:r>
+      <w:r>
+        <w:rPr>
+          <w:rFonts w:ascii="Times New Roman" w:hAnsi="Times New Roman" w:cs="Times New Roman"/>
+          <w:sz w:val="26"/>
+          <w:szCs w:val="26"/>
+        </w:rPr>
+        <w:t>....</w:t>
+      </w:r>
+    </w:p>
+    <w:p>
+      <w:pPr>
+        <w:spacing w:line="240" w:lineRule="auto"/>
+        <w:rPr>
+          <w:rFonts w:ascii="Times New Roman" w:hAnsi="Times New Roman" w:cs="Times New Roman"/>
+          <w:sz w:val="26"/>
+          <w:szCs w:val="26"/>
+        </w:rPr>
+      </w:pPr>
+      <w:r>
+        <w:rPr>
+          <w:rFonts w:ascii="Times New Roman" w:hAnsi="Times New Roman" w:cs="Times New Roman"/>
+          <w:sz w:val="26"/>
+          <w:szCs w:val="26"/>
+        </w:rPr>
+        <w:t>2. Đại diện chủ đất/chủ nhà</w:t>
+      </w:r>
+      <w:r>
+        <w:rPr>
+          <w:rFonts w:ascii="Times New Roman" w:hAnsi="Times New Roman" w:cs="Times New Roman"/>
+          <w:sz w:val="26"/>
+          <w:szCs w:val="26"/>
+        </w:rPr>
+        <w:t>/bên cho thuê</w:t>
+      </w:r>
+      <w:r>
+        <w:rPr>
+          <w:rFonts w:ascii="Times New Roman" w:hAnsi="Times New Roman" w:cs="Times New Roman"/>
+          <w:sz w:val="26"/>
+          <w:szCs w:val="26"/>
+        </w:rPr>
+        <w:t>:</w:t>
+      </w:r>
+    </w:p>
+    <w:p>
+      <w:pPr>
+        <w:spacing w:line="240" w:lineRule="auto"/>
+        <w:rPr>
+          <w:rFonts w:ascii="Times New Roman" w:hAnsi="Times New Roman" w:cs="Times New Roman"/>
+          <w:sz w:val="26"/>
+          <w:szCs w:val="26"/>
+        </w:rPr>
+      </w:pPr>
+      <w:r>
+        <w:rPr>
+          <w:rFonts w:ascii="Times New Roman" w:hAnsi="Times New Roman" w:cs="Times New Roman"/>
+          <w:sz w:val="26"/>
+          <w:szCs w:val="26"/>
+        </w:rPr>
+        <w:t>- Tên cơ quan (gia đình): {{COMPANY_NAME}}…………………………………………………………………….</w:t>
+      </w:r>
+    </w:p>
+    <w:p>
+      <w:pPr>
+        <w:spacing w:line="240" w:lineRule="auto"/>
+        <w:rPr>
+          <w:rFonts w:ascii="Times New Roman" w:hAnsi="Times New Roman" w:cs="Times New Roman"/>
+          <w:sz w:val="26"/>
+          <w:szCs w:val="26"/>
+        </w:rPr>
+      </w:pPr>
+      <w:r>
+        <w:rPr>
+          <w:rFonts w:ascii="Times New Roman" w:hAnsi="Times New Roman" w:cs="Times New Roman"/>
+          <w:sz w:val="26"/>
+          <w:szCs w:val="26"/>
+        </w:rPr>
+        <w:t>- Họ tên người đại diện: {{LANDLORD_NAME}} </w:t>
+      </w:r>
+      <w:r>
+        <w:rPr>
+          <w:rFonts w:ascii="Times New Roman" w:hAnsi="Times New Roman" w:cs="Times New Roman"/>
+          <w:sz w:val="26"/>
+          <w:szCs w:val="26"/>
+        </w:rPr>
+        <w:t>.............................</w:t>
+      </w:r>
+      <w:r>
+        <w:rPr>
+          <w:rFonts w:ascii="Times New Roman" w:hAnsi="Times New Roman" w:cs="Times New Roman"/>
+          <w:sz w:val="26"/>
+          <w:szCs w:val="26"/>
+        </w:rPr>
+        <w:t>........................</w:t>
+      </w:r>
+      <w:r>
+        <w:rPr>
+          <w:rFonts w:ascii="Times New Roman" w:hAnsi="Times New Roman" w:cs="Times New Roman"/>
+          <w:sz w:val="26"/>
+          <w:szCs w:val="26"/>
+        </w:rPr>
+        <w:t xml:space="preserve">  SĐT: {{LANDLORD_PHONE}} ...............</w:t>
+      </w:r>
+      <w:r>
+        <w:rPr>
+          <w:rFonts w:ascii="Times New Roman" w:hAnsi="Times New Roman" w:cs="Times New Roman"/>
+          <w:sz w:val="26"/>
+          <w:szCs w:val="26"/>
+        </w:rPr>
+        <w:t>.........................</w:t>
+      </w:r>
+    </w:p>
+    <w:p>
+      <w:pPr>
+        <w:spacing w:line="240" w:lineRule="auto"/>
+        <w:rPr>
+          <w:rFonts w:ascii="Times New Roman" w:hAnsi="Times New Roman" w:cs="Times New Roman"/>
+          <w:sz w:val="26"/>
+          <w:szCs w:val="26"/>
+        </w:rPr>
+      </w:pPr>
+      <w:r>
+        <w:rPr>
+          <w:rFonts w:ascii="Times New Roman" w:hAnsi="Times New Roman" w:cs="Times New Roman"/>
+          <w:sz w:val="26"/>
+          <w:szCs w:val="26"/>
+        </w:rPr>
+        <w:t>- CCCD/CMND: {{LANDLORD_CCCD}} .......................................................</w:t>
+      </w:r>
+      <w:r>
+        <w:rPr>
+          <w:rFonts w:ascii="Times New Roman" w:hAnsi="Times New Roman" w:cs="Times New Roman"/>
+          <w:sz w:val="26"/>
+          <w:szCs w:val="26"/>
+        </w:rPr>
+        <w:t>.................</w:t>
+      </w:r>
+      <w:r>
+        <w:rPr>
+          <w:rFonts w:ascii="Times New Roman" w:hAnsi="Times New Roman" w:cs="Times New Roman"/>
+          <w:sz w:val="26"/>
+          <w:szCs w:val="26"/>
+        </w:rPr>
+        <w:t>.........................................</w:t>
+      </w:r>
+      <w:r>
+        <w:rPr>
+          <w:rFonts w:ascii="Times New Roman" w:hAnsi="Times New Roman" w:cs="Times New Roman"/>
+          <w:sz w:val="26"/>
+          <w:szCs w:val="26"/>
+        </w:rPr>
+        <w:t>..</w:t>
+      </w:r>
+    </w:p>
+    <w:p>
+      <w:pPr>
+        <w:tabs>
+          <w:tab w:val="left" w:pos="4222"/>
+        </w:tabs>
+        <w:rPr>
+          <w:rFonts w:ascii="Times New Roman" w:hAnsi="Times New Roman" w:cs="Times New Roman"/>
+          <w:b/>
+          <w:sz w:val="26"/>
+          <w:szCs w:val="26"/>
+        </w:rPr>
+      </w:pPr>
+      <w:r>
+        <w:rPr>
+          <w:rFonts w:ascii="Times New Roman" w:hAnsi="Times New Roman" w:cs="Times New Roman"/>
+          <w:b/>
+          <w:sz w:val="26"/>
+          <w:szCs w:val="26"/>
+        </w:rPr>
+        <w:t xml:space="preserve">III. </w:t>
+      </w:r>
+      <w:r>
+        <w:rPr>
+          <w:rFonts w:ascii="Times New Roman" w:hAnsi="Times New Roman" w:cs="Times New Roman"/>
+          <w:b/>
+          <w:sz w:val="26"/>
+          <w:szCs w:val="26"/>
+        </w:rPr>
+        <w:t>KẾT QUẢ KHẢO SÁT</w:t>
+      </w:r>
+    </w:p>
+    <w:p>
+      <w:pPr>
+        <w:tabs>
+          <w:tab w:val="left" w:pos="4222"/>
+        </w:tabs>
+        <w:rPr>
+          <w:rFonts w:ascii="Times New Roman" w:hAnsi="Times New Roman" w:cs="Times New Roman"/>
+          <w:sz w:val="26"/>
+          <w:szCs w:val="26"/>
+        </w:rPr>
+      </w:pPr>
+      <w:r>
+        <w:rPr>
+          <w:rFonts w:ascii="Times New Roman" w:hAnsi="Times New Roman" w:cs="Times New Roman"/>
+          <w:sz w:val="26"/>
+          <w:szCs w:val="26"/>
+        </w:rPr>
+        <w:t xml:space="preserve">Đơn vị cho thuê </w:t>
+      </w:r>
+      <w:r>
+        <w:rPr>
+          <w:rFonts w:ascii="Times New Roman" w:hAnsi="Times New Roman" w:cs="Times New Roman"/>
+          <w:sz w:val="26"/>
+          <w:szCs w:val="26"/>
+        </w:rPr>
+        <w:t xml:space="preserve">(Bên </w:t>
+      </w:r>
+      <w:r>
+        <w:rPr>
+          <w:rFonts w:ascii="Times New Roman" w:hAnsi="Times New Roman" w:cs="Times New Roman"/>
+          <w:sz w:val="26"/>
+          <w:szCs w:val="26"/>
+        </w:rPr>
+        <w:t>B</w:t>
+      </w:r>
+      <w:r>
+        <w:rPr>
+          <w:rFonts w:ascii="Times New Roman" w:hAnsi="Times New Roman" w:cs="Times New Roman"/>
+          <w:sz w:val="26"/>
+          <w:szCs w:val="26"/>
+        </w:rPr>
+        <w:t>)</w:t>
+      </w:r>
+      <w:r>
+        <w:rPr>
+          <w:rFonts w:ascii="Times New Roman" w:hAnsi="Times New Roman" w:cs="Times New Roman"/>
+          <w:sz w:val="26"/>
+          <w:szCs w:val="26"/>
+        </w:rPr>
+        <w:t xml:space="preserve"> đồng ý cho MobiFone Đồng Nai thuê mặt bằng để xây dựng/lắp đặt trạm điện thoại di động BTS với những </w:t>
+      </w:r>
+      <w:r>
+        <w:rPr>
+          <w:rFonts w:ascii="Times New Roman" w:hAnsi="Times New Roman" w:cs="Times New Roman"/>
+          <w:sz w:val="26"/>
+          <w:szCs w:val="26"/>
+        </w:rPr>
+        <w:t>thông tin</w:t>
+      </w:r>
+      <w:r>
+        <w:rPr>
+          <w:rFonts w:ascii="Times New Roman" w:hAnsi="Times New Roman" w:cs="Times New Roman"/>
+          <w:sz w:val="26"/>
+          <w:szCs w:val="26"/>
+        </w:rPr>
+        <w:t xml:space="preserve"> như sau:</w:t>
+      </w:r>
+    </w:p>
+    <w:p>
+      <w:pPr>
+        <w:spacing w:line="240" w:lineRule="auto"/>
+        <w:rPr>
+          <w:rFonts w:ascii="Times New Roman" w:hAnsi="Times New Roman" w:cs="Times New Roman"/>
+          <w:sz w:val="26"/>
+          <w:szCs w:val="26"/>
+        </w:rPr>
+      </w:pPr>
+      <w:r>
+        <w:rPr>
+          <w:rFonts w:ascii="Times New Roman" w:hAnsi="Times New Roman" w:cs="Times New Roman"/>
+          <w:sz w:val="26"/>
+          <w:szCs w:val="26"/>
+        </w:rPr>
+        <w:t xml:space="preserve">- </w:t>
+      </w:r>
+      <w:r>
+        <w:rPr>
+          <w:rFonts w:ascii="Times New Roman" w:hAnsi="Times New Roman" w:cs="Times New Roman"/>
+          <w:sz w:val="26"/>
+          <w:szCs w:val="26"/>
+        </w:rPr>
+        <w:t>Vị trí d</w:t>
+      </w:r>
+      <w:r>
+        <w:rPr>
+          <w:rFonts w:ascii="Times New Roman" w:hAnsi="Times New Roman" w:cs="Times New Roman"/>
+          <w:sz w:val="26"/>
+          <w:szCs w:val="26"/>
+        </w:rPr>
+        <w:t>ự</w:t>
+      </w:r>
+      <w:r>
+        <w:rPr>
+          <w:rFonts w:ascii="Times New Roman" w:hAnsi="Times New Roman" w:cs="Times New Roman"/>
+          <w:sz w:val="26"/>
+          <w:szCs w:val="26"/>
+        </w:rPr>
+        <w:t>ng cột anten</w:t>
+      </w:r>
+      <w:r>
+        <w:rPr>
+          <w:rFonts w:ascii="Times New Roman" w:hAnsi="Times New Roman" w:cs="Times New Roman"/>
+          <w:sz w:val="26"/>
+          <w:szCs w:val="26"/>
+        </w:rPr>
+        <w:t xml:space="preserve">: </w:t>
+      </w:r>
+      <w:r>
+        <w:rPr>
+          <w:rFonts w:ascii="Segoe UI Symbol" w:hAnsi="Segoe UI Symbol" w:cs="Segoe UI Symbol"/>
+          <w:sz w:val="26"/>
+          <w:szCs w:val="26"/>
+        </w:rPr>
+        <w:t>{{#IS_MAT_DAT}}☑{{/IS_MAT_DAT}}{{^IS_MAT_DAT}}☐{{/IS_MAT_DAT}} Mặt đất</w:t>
+      </w:r>
+      <w:r>
+        <w:rPr>
+          <w:rFonts w:ascii="Times New Roman" w:hAnsi="Times New Roman" w:cs="Times New Roman"/>
+          <w:sz w:val="26"/>
+          <w:szCs w:val="26"/>
+        </w:rPr>
+        <w:tab/>
+      </w:r>
+      <w:r>
+        <w:rPr>
+          <w:rFonts w:ascii="Times New Roman" w:hAnsi="Times New Roman" w:cs="Times New Roman"/>
+          <w:sz w:val="26"/>
+          <w:szCs w:val="26"/>
+        </w:rPr>
+        <w:tab/>
+      </w:r>
+      <w:r>
+        <w:rPr>
+          <w:rFonts w:ascii="Segoe UI Symbol" w:hAnsi="Segoe UI Symbol" w:cs="Segoe UI Symbol"/>
+          <w:sz w:val="26"/>
+          <w:szCs w:val="26"/>
+        </w:rPr>
+        <w:t>{{#IS_MAI_NHA}}☑{{/IS_MAI_NHA}}{{^IS_MAI_NHA}}☐{{/IS_MAI_NHA}} Mái nhà: {{ROOF_SHEETS}} tấm, cao {{ROOF_HEIGHT}} mét…… tấm, cao……. mét</w:t>
+      </w:r>
+    </w:p>
+    <w:p>
+      <w:pPr>
+        <w:spacing w:line="240" w:lineRule="auto"/>
+        <w:rPr>
+          <w:rFonts w:ascii="Times New Roman" w:hAnsi="Times New Roman" w:cs="Times New Roman"/>
+          <w:sz w:val="26"/>
+          <w:szCs w:val="26"/>
+        </w:rPr>
+      </w:pPr>
+      <w:r>
+        <w:rPr>
+          <w:rFonts w:ascii="Times New Roman" w:hAnsi="Times New Roman" w:cs="Times New Roman"/>
+          <w:sz w:val="26"/>
+          <w:szCs w:val="26"/>
+        </w:rPr>
+        <w:t>- Ghi chú đặc điểm đất, nhà: {{SURVEY_NOTES}} (</w:t>
+      </w:r>
+      <w:r>
+        <w:rPr>
+          <w:rFonts w:ascii="Times New Roman" w:hAnsi="Times New Roman" w:cs="Times New Roman"/>
+          <w:i/>
+          <w:iCs/>
+          <w:sz w:val="26"/>
+          <w:szCs w:val="26"/>
+        </w:rPr>
+        <w:t>đồi, núi, ao, đầm lầy, ruộng, đất độ dốc, gần taluy, gần sông hồ, điện cao thế, trung thế,</w:t>
+      </w:r>
+      <w:r>
+        <w:rPr>
+          <w:rFonts w:ascii="Times New Roman" w:hAnsi="Times New Roman" w:cs="Times New Roman"/>
+          <w:i/>
+          <w:iCs/>
+          <w:sz w:val="26"/>
+          <w:szCs w:val="26"/>
+        </w:rPr>
+        <w:t xml:space="preserve">loại </w:t>
+      </w:r>
+      <w:r>
+        <w:rPr>
+          <w:rFonts w:ascii="Times New Roman" w:hAnsi="Times New Roman" w:cs="Times New Roman"/>
+          <w:i/>
+          <w:iCs/>
+          <w:sz w:val="26"/>
+          <w:szCs w:val="26"/>
+        </w:rPr>
+        <w:t>mái nhà,</w:t>
+      </w:r>
+      <w:r>
+        <w:rPr>
+          <w:rFonts w:ascii="Times New Roman" w:hAnsi="Times New Roman" w:cs="Times New Roman"/>
+          <w:i/>
+          <w:iCs/>
+          <w:sz w:val="26"/>
+          <w:szCs w:val="26"/>
+        </w:rPr>
+        <w:t>…</w:t>
+      </w:r>
+      <w:r>
+        <w:rPr>
+          <w:rFonts w:ascii="Times New Roman" w:hAnsi="Times New Roman" w:cs="Times New Roman"/>
+          <w:sz w:val="26"/>
+          <w:szCs w:val="26"/>
+        </w:rPr>
+        <w:t>) ……………………………………….</w:t>
+      </w:r>
+    </w:p>
+    <w:p>
+      <w:pPr>
+        <w:spacing w:line="240" w:lineRule="auto"/>
+        <w:rPr>
+          <w:rFonts w:ascii="Times New Roman" w:hAnsi="Times New Roman" w:cs="Times New Roman"/>
+          <w:sz w:val="26"/>
+          <w:szCs w:val="26"/>
+        </w:rPr>
+      </w:pPr>
+      <w:r>
+        <w:rPr>
+          <w:rFonts w:ascii="Times New Roman" w:hAnsi="Times New Roman" w:cs="Times New Roman"/>
+          <w:sz w:val="26"/>
+          <w:szCs w:val="26"/>
+        </w:rPr>
+        <w:t xml:space="preserve">- </w:t>
+      </w:r>
+      <w:r>
+        <w:rPr>
+          <w:rFonts w:ascii="Times New Roman" w:hAnsi="Times New Roman" w:cs="Times New Roman"/>
+          <w:sz w:val="26"/>
+          <w:szCs w:val="26"/>
+        </w:rPr>
+        <w:t>Kích thước DxR khu đất/mái nhà: {{LAND_DIMENSIONS}} m…………..m       </w:t>
+      </w:r>
+    </w:p>
+    <w:p>
+      <w:pPr>
+        <w:spacing w:line="240" w:lineRule="auto"/>
+        <w:rPr>
+          <w:rFonts w:ascii="Times New Roman" w:hAnsi="Times New Roman" w:cs="Times New Roman"/>
+          <w:sz w:val="26"/>
+          <w:szCs w:val="26"/>
+        </w:rPr>
+      </w:pPr>
+      <w:r>
+        <w:rPr>
+          <w:rFonts w:ascii="Times New Roman" w:hAnsi="Times New Roman" w:cs="Times New Roman"/>
+          <w:sz w:val="26"/>
+          <w:szCs w:val="26"/>
+        </w:rPr>
+        <w:t>- Kích thước dự kiến thuê sử dụng xây dựng trạm (DxR): {{LEASED_DIMENSIONS}} m (Diện tích: {{LEASED_AREA}} m²) .......... </w:t>
+      </w:r>
+      <w:r>
+        <w:rPr>
+          <w:rFonts w:ascii="Times New Roman" w:hAnsi="Times New Roman" w:cs="Times New Roman"/>
+          <w:sz w:val="26"/>
+          <w:szCs w:val="26"/>
+        </w:rPr>
+        <w:t>m……….</w:t>
+      </w:r>
+      <w:r>
+        <w:rPr>
+          <w:rFonts w:ascii="Times New Roman" w:hAnsi="Times New Roman" w:cs="Times New Roman"/>
+          <w:sz w:val="26"/>
+          <w:szCs w:val="26"/>
+        </w:rPr>
+        <w:t>m²</w:t>
+      </w:r>
+    </w:p>
+    <w:p>
+      <w:pPr>
+        <w:spacing w:line="240" w:lineRule="auto"/>
+        <w:rPr>
+          <w:rFonts w:ascii="Times New Roman" w:hAnsi="Times New Roman" w:cs="Times New Roman"/>
+          <w:sz w:val="26"/>
+          <w:szCs w:val="26"/>
+        </w:rPr>
+      </w:pPr>
+      <w:r>
+        <w:rPr>
+          <w:rFonts w:ascii="Times New Roman" w:hAnsi="Times New Roman" w:cs="Times New Roman"/>
+          <w:sz w:val="26"/>
+          <w:szCs w:val="26"/>
+        </w:rPr>
+        <w:lastRenderedPageBreak/>
+        <w:t xml:space="preserve">- Đường vào: </w:t>
+      </w:r>
+      <w:r>
+        <w:rPr>
+          <w:rFonts w:ascii="Times New Roman" w:hAnsi="Times New Roman" w:cs="Times New Roman"/>
+          <w:sz w:val="26"/>
+          <w:szCs w:val="26"/>
+        </w:rPr>
+        <w:tab/>
+      </w:r>
+      <w:r>
+        <w:rPr>
+          <w:rFonts w:ascii="Segoe UI Symbol" w:hAnsi="Segoe UI Symbol" w:cs="Segoe UI Symbol"/>
+          <w:sz w:val="26"/>
+          <w:szCs w:val="26"/>
+        </w:rPr>
+        <w:t>{{#ACCESS_CAR}}☑{{/ACCESS_CAR}}{{^ACCESS_CAR}}☐{{/ACCESS_CAR}} Ô tô </w:t>
+      </w:r>
+      <w:r>
+        <w:rPr>
+          <w:rFonts w:ascii="Times New Roman" w:hAnsi="Times New Roman" w:cs="Times New Roman"/>
+          <w:sz w:val="26"/>
+          <w:szCs w:val="26"/>
+        </w:rPr>
+        <w:tab/>
+      </w:r>
+      <w:r>
+        <w:rPr>
+          <w:rFonts w:ascii="Segoe UI Symbol" w:hAnsi="Segoe UI Symbol" w:cs="Segoe UI Symbol"/>
+          <w:sz w:val="26"/>
+          <w:szCs w:val="26"/>
+        </w:rPr>
+        <w:t>{{#ACCESS_BIKE}}☑{{/ACCESS_BIKE}}{{^ACCESS_BIKE}}☐{{/ACCESS_BIKE}} Xe máy </w:t>
+      </w:r>
+      <w:r>
+        <w:rPr>
+          <w:rFonts w:ascii="Times New Roman" w:hAnsi="Times New Roman" w:cs="Times New Roman"/>
+          <w:sz w:val="26"/>
+          <w:szCs w:val="26"/>
+        </w:rPr>
+        <w:tab/>
+      </w:r>
+      <w:r>
+        <w:rPr>
+          <w:rFonts w:ascii="Times New Roman" w:hAnsi="Times New Roman" w:cs="Times New Roman"/>
+          <w:sz w:val="26"/>
+          <w:szCs w:val="26"/>
+        </w:rPr>
+        <w:tab/>
+      </w:r>
+      <w:r>
+        <w:rPr>
+          <w:rFonts w:ascii="Segoe UI Symbol" w:hAnsi="Segoe UI Symbol" w:cs="Segoe UI Symbol"/>
+          <w:sz w:val="26"/>
+          <w:szCs w:val="26"/>
+        </w:rPr>
+        <w:t>{{#ACCESS_WALK}}☑{{/ACCESS_WALK}}{{^ACCESS_WALK}}☐{{/ACCESS_WALK}} Đi bộ</w:t>
+      </w:r>
+    </w:p>
+    <w:p>
+      <w:pPr>
+        <w:spacing w:line="240" w:lineRule="auto"/>
+        <w:rPr>
+          <w:rFonts w:ascii="Times New Roman" w:hAnsi="Times New Roman" w:cs="Times New Roman"/>
+          <w:sz w:val="26"/>
+          <w:szCs w:val="26"/>
+        </w:rPr>
+      </w:pPr>
+      <w:r>
+        <w:rPr>
+          <w:rFonts w:ascii="Times New Roman" w:hAnsi="Times New Roman" w:cs="Times New Roman"/>
+          <w:sz w:val="26"/>
+          <w:szCs w:val="26"/>
+        </w:rPr>
+        <w:t xml:space="preserve">- Nguồn điện lưới: </w:t>
+      </w:r>
+      <w:r>
+        <w:rPr>
+          <w:rFonts w:ascii="Segoe UI Symbol" w:hAnsi="Segoe UI Symbol" w:cs="Segoe UI Symbol"/>
+          <w:sz w:val="26"/>
+          <w:szCs w:val="26"/>
+        </w:rPr>
+        <w:t>{{#POWER_DIRECT}}☑{{/POWER_DIRECT}}{{^POWER_DIRECT}}☐{{/POWER_DIRECT}} điện kế ĐL</w:t>
+      </w:r>
+      <w:r>
+        <w:rPr>
+          <w:rFonts w:ascii="Times New Roman" w:hAnsi="Times New Roman" w:cs="Times New Roman"/>
+          <w:sz w:val="26"/>
+          <w:szCs w:val="26"/>
+        </w:rPr>
+        <w:t xml:space="preserve"> </w:t>
+      </w:r>
+      <w:r>
+        <w:rPr>
+          <w:rFonts w:ascii="Times New Roman" w:hAnsi="Times New Roman" w:cs="Times New Roman"/>
+          <w:sz w:val="26"/>
+          <w:szCs w:val="26"/>
+        </w:rPr>
+        <w:t xml:space="preserve">   </w:t>
+      </w:r>
+      <w:r>
+        <w:rPr>
+          <w:rFonts w:ascii="Segoe UI Symbol" w:hAnsi="Segoe UI Symbol" w:cs="Segoe UI Symbol"/>
+          <w:sz w:val="26"/>
+          <w:szCs w:val="26"/>
+        </w:rPr>
+        <w:t>{{#POWER_SHARE}}☑{{/POWER_SHARE}}{{^POWER_SHARE}}☐{{/POWER_SHARE}} không có hạ thế, câu đuôi     </w:t>
+      </w:r>
+      <w:r>
+        <w:rPr>
+          <w:rFonts w:ascii="Segoe UI Symbol" w:hAnsi="Segoe UI Symbol" w:cs="Segoe UI Symbol"/>
+          <w:sz w:val="26"/>
+          <w:szCs w:val="26"/>
+        </w:rPr>
+        <w:t>{{#POWER_SUBSTATION}}☑{{/POWER_SUBSTATION}}{{^POWER_SUBSTATION}}☐{{/POWER_SUBSTATION}} trang bị MBA riêng</w:t>
+      </w:r>
+      <w:r>
+        <w:rPr>
+          <w:rFonts w:ascii="Times New Roman" w:hAnsi="Times New Roman" w:cs="Times New Roman"/>
+          <w:sz w:val="26"/>
+          <w:szCs w:val="26"/>
+        </w:rPr>
+        <w:tab/>
+      </w:r>
+    </w:p>
+    <w:p>
+      <w:pPr>
+        <w:spacing w:line="240" w:lineRule="auto"/>
+        <w:rPr>
+          <w:rFonts w:ascii="Times New Roman" w:hAnsi="Times New Roman" w:cs="Times New Roman"/>
+          <w:sz w:val="26"/>
+          <w:szCs w:val="26"/>
+        </w:rPr>
+      </w:pPr>
+      <w:r>
+        <w:rPr>
+          <w:rFonts w:ascii="Times New Roman" w:hAnsi="Times New Roman" w:cs="Times New Roman"/>
+          <w:sz w:val="26"/>
+          <w:szCs w:val="26"/>
+        </w:rPr>
+        <w:t>- Khoảng cách đến vị trí đấu điện lưới dự kiến: {{POWER_DISTANCE}} m…………………………………………….</w:t>
+      </w:r>
+    </w:p>
+    <w:p>
+      <w:pPr>
+        <w:spacing w:line="240" w:lineRule="auto"/>
+        <w:rPr>
+          <w:rFonts w:ascii="Times New Roman" w:hAnsi="Times New Roman" w:cs="Times New Roman"/>
+          <w:sz w:val="26"/>
+          <w:szCs w:val="26"/>
+        </w:rPr>
+      </w:pPr>
+      <w:r>
+        <w:rPr>
+          <w:rFonts w:ascii="Times New Roman" w:hAnsi="Times New Roman" w:cs="Times New Roman"/>
+          <w:sz w:val="26"/>
+          <w:szCs w:val="26"/>
+        </w:rPr>
+        <w:t xml:space="preserve">- Khả năng kéo cáp quang: {{FIBER_CAPABILITY}} </w:t>
+      </w:r>
+      <w:r>
+        <w:rPr>
+          <w:rFonts w:ascii="Segoe UI Symbol" w:hAnsi="Segoe UI Symbol" w:cs="Segoe UI Symbol"/>
+          <w:sz w:val="26"/>
+          <w:szCs w:val="26"/>
+        </w:rPr>
+        <w:t>…………………………………………………………………………………………</w:t>
+      </w:r>
+    </w:p>
+    <w:p>
+      <w:pPr>
+        <w:spacing w:line="240" w:lineRule="auto"/>
+        <w:rPr>
+          <w:rFonts w:ascii="Times New Roman" w:hAnsi="Times New Roman" w:cs="Times New Roman"/>
+          <w:sz w:val="26"/>
+          <w:szCs w:val="26"/>
+        </w:rPr>
+      </w:pPr>
+      <w:r>
+        <w:rPr>
+          <w:rFonts w:ascii="Times New Roman" w:hAnsi="Times New Roman" w:cs="Times New Roman"/>
+          <w:sz w:val="26"/>
+          <w:szCs w:val="26"/>
+        </w:rPr>
+        <w:t xml:space="preserve">- </w:t>
+      </w:r>
+      <w:r>
+        <w:rPr>
+          <w:rFonts w:ascii="Times New Roman" w:hAnsi="Times New Roman" w:cs="Times New Roman"/>
+          <w:sz w:val="26"/>
+          <w:szCs w:val="26"/>
+        </w:rPr>
+        <w:t xml:space="preserve">Pháp lý đất/nhà: </w:t>
+      </w:r>
+      <w:r>
+        <w:rPr>
+          <w:rFonts w:ascii="Segoe UI Symbol" w:hAnsi="Segoe UI Symbol" w:cs="Segoe UI Symbol"/>
+          <w:sz w:val="26"/>
+          <w:szCs w:val="26"/>
+        </w:rPr>
+        <w:t>{{#LEGAL_RED_BOOK}}☑{{/LEGAL_RED_BOOK}}{{^LEGAL_RED_BOOK}}☐{{/LEGAL_RED_BOOK}} Giấy chứng nhận QSD nhà/ đất</w:t>
+      </w:r>
+      <w:r>
+        <w:rPr>
+          <w:rFonts w:ascii="Times New Roman" w:hAnsi="Times New Roman" w:cs="Times New Roman"/>
+          <w:sz w:val="26"/>
+          <w:szCs w:val="26"/>
+        </w:rPr>
+        <w:tab/>
+      </w:r>
+      <w:r>
+        <w:rPr>
+          <w:rFonts w:ascii="Segoe UI Symbol" w:hAnsi="Segoe UI Symbol" w:cs="Segoe UI Symbol"/>
+          <w:sz w:val="26"/>
+          <w:szCs w:val="26"/>
+        </w:rPr>
+        <w:t>{{#LEGAL_OTHER}}☑{{/LEGAL_OTHER}}{{^LEGAL_OTHER}}☐{{/LEGAL_OTHER}} Khác: {{LEGAL_OTHER_DESC}}…………………………</w:t>
+      </w:r>
+      <w:r>
+        <w:rPr>
+          <w:rFonts w:ascii="Times New Roman" w:hAnsi="Times New Roman" w:cs="Times New Roman"/>
+          <w:sz w:val="26"/>
+          <w:szCs w:val="26"/>
+        </w:rPr>
+        <w:t>.</w:t>
+      </w:r>
+    </w:p>
+    <w:p>
+      <w:pPr>
+        <w:spacing w:line="240" w:lineRule="auto"/>
+        <w:rPr>
+          <w:rFonts w:ascii="Times New Roman" w:hAnsi="Times New Roman" w:cs="Times New Roman"/>
+          <w:sz w:val="26"/>
+          <w:szCs w:val="26"/>
+        </w:rPr>
+      </w:pPr>
+      <w:r>
+        <w:rPr>
+          <w:rFonts w:ascii="Times New Roman" w:hAnsi="Times New Roman" w:cs="Times New Roman"/>
+          <w:sz w:val="26"/>
+          <w:szCs w:val="26"/>
+        </w:rPr>
+        <w:t xml:space="preserve">- Dạng trạm dự kiến: </w:t>
+      </w:r>
+      <w:r>
+        <w:rPr>
+          <w:rFonts w:ascii="Times New Roman" w:hAnsi="Times New Roman" w:cs="Times New Roman"/>
+          <w:sz w:val="26"/>
+          <w:szCs w:val="26"/>
+        </w:rPr>
+        <w:tab/>
+      </w:r>
+      <w:r>
+        <w:rPr>
+          <w:rFonts w:ascii="Segoe UI Symbol" w:hAnsi="Segoe UI Symbol" w:cs="Segoe UI Symbol"/>
+          <w:sz w:val="26"/>
+          <w:szCs w:val="26"/>
+        </w:rPr>
+        <w:t>{{#ANTENNA_GUYED}}☑{{/ANTENNA_GUYED}}{{^ANTENNA_GUYED}}☐{{/ANTENNA_GUYED}} Dây co mặt đất</w:t>
+      </w:r>
+      <w:r>
+        <w:rPr>
+          <w:rFonts w:ascii="Times New Roman" w:hAnsi="Times New Roman" w:cs="Times New Roman"/>
+          <w:sz w:val="26"/>
+          <w:szCs w:val="26"/>
+        </w:rPr>
+        <w:tab/>
+      </w:r>
+      <w:r>
+        <w:rPr>
+          <w:rFonts w:ascii="Times New Roman" w:hAnsi="Times New Roman" w:cs="Times New Roman"/>
+          <w:sz w:val="26"/>
+          <w:szCs w:val="26"/>
+        </w:rPr>
+        <w:tab/>
+      </w:r>
+      <w:r>
+        <w:rPr>
+          <w:rFonts w:ascii="Segoe UI Symbol" w:hAnsi="Segoe UI Symbol" w:cs="Segoe UI Symbol"/>
+          <w:sz w:val="26"/>
+          <w:szCs w:val="26"/>
+        </w:rPr>
+        <w:t>{{#ANTENNA_MONOPOLE}}☑{{/ANTENNA_MONOPOLE}}{{^ANTENNA_MONOPOLE}}☐{{/ANTENNA_MONOPOLE}} Cột monopole mặt đất</w:t>
+      </w:r>
+    </w:p>
+    <w:p>
+      <w:pPr>
+        <w:spacing w:line="240" w:lineRule="auto"/>
+        <w:rPr>
+          <w:rFonts w:ascii="Times New Roman" w:hAnsi="Times New Roman" w:cs="Times New Roman"/>
+          <w:sz w:val="26"/>
+          <w:szCs w:val="26"/>
+        </w:rPr>
+      </w:pPr>
+      <w:r>
+        <w:rPr>
+          <w:rFonts w:ascii="Segoe UI Symbol" w:hAnsi="Segoe UI Symbol" w:cs="Segoe UI Symbol"/>
+          <w:sz w:val="26"/>
+          <w:szCs w:val="26"/>
+        </w:rPr>
+        <w:t xml:space="preserve"> </w:t>
+      </w:r>
+      <w:r>
+        <w:rPr>
+          <w:rFonts w:ascii="Times New Roman" w:hAnsi="Times New Roman" w:cs="Times New Roman"/>
+          <w:sz w:val="26"/>
+          <w:szCs w:val="26"/>
+        </w:rPr>
+        <w:t xml:space="preserve">- Chiều cao cột anten dự kiến: </w:t>
+      </w:r>
+      <w:r>
+        <w:rPr>
+          <w:rFonts w:ascii="Segoe UI Symbol" w:hAnsi="Segoe UI Symbol" w:cs="Segoe UI Symbol"/>
+          <w:sz w:val="26"/>
+          <w:szCs w:val="26"/>
+        </w:rPr>
+        <w:t>{{#HEIGHT_30}}☑{{/HEIGHT_30}}{{^HEIGHT_30}}☐{{/HEIGHT_30}} 30m</w:t>
+      </w:r>
+      <w:r>
+        <w:rPr>
+          <w:rFonts w:ascii="Times New Roman" w:hAnsi="Times New Roman" w:cs="Times New Roman"/>
+          <w:sz w:val="26"/>
+          <w:szCs w:val="26"/>
+        </w:rPr>
+        <w:tab/>
+      </w:r>
+      <w:r>
+        <w:rPr>
+          <w:rFonts w:ascii="Segoe UI Symbol" w:hAnsi="Segoe UI Symbol" w:cs="Segoe UI Symbol"/>
+          <w:sz w:val="26"/>
+          <w:szCs w:val="26"/>
+        </w:rPr>
+        <w:t>{{#HEIGHT_36}}☑{{/HEIGHT_36}}{{^HEIGHT_36}}☐{{/HEIGHT_36}} 36m</w:t>
+      </w:r>
+      <w:r>
+        <w:rPr>
+          <w:rFonts w:ascii="Times New Roman" w:hAnsi="Times New Roman" w:cs="Times New Roman"/>
+          <w:sz w:val="26"/>
+          <w:szCs w:val="26"/>
+        </w:rPr>
+        <w:tab/>
+      </w:r>
+      <w:r>
+        <w:rPr>
+          <w:rFonts w:ascii="Segoe UI Symbol" w:hAnsi="Segoe UI Symbol" w:cs="Segoe UI Symbol"/>
+          <w:sz w:val="26"/>
+          <w:szCs w:val="26"/>
+        </w:rPr>
+        <w:t>{{#HEIGHT_42}}☑{{/HEIGHT_42}}{{^HEIGHT_42}}☐{{/HEIGHT_42}} 42m</w:t>
+      </w:r>
+      <w:r>
+        <w:rPr>
+          <w:rFonts w:ascii="Times New Roman" w:hAnsi="Times New Roman" w:cs="Times New Roman"/>
+          <w:sz w:val="26"/>
+          <w:szCs w:val="26"/>
+        </w:rPr>
+        <w:tab/>
+      </w:r>
+      <w:r>
+        <w:rPr>
+          <w:rFonts w:ascii="Segoe UI Symbol" w:hAnsi="Segoe UI Symbol" w:cs="Segoe UI Symbol"/>
+          <w:sz w:val="26"/>
+          <w:szCs w:val="26"/>
+        </w:rPr>
+        <w:t>{{#HEIGHT_OTHER}}☑{{/HEIGHT_OTHER}}{{^HEIGHT_OTHER}}☐{{/HEIGHT_OTHER}} Khác: {{HEIGHT_OTHER_DESC}} ……</w:t>
+      </w:r>
+      <w:r>
+        <w:rPr>
+          <w:rFonts w:ascii="Times New Roman" w:hAnsi="Times New Roman" w:cs="Times New Roman"/>
+          <w:sz w:val="26"/>
+          <w:szCs w:val="26"/>
+        </w:rPr>
+        <w:t>………</w:t>
+      </w:r>
+    </w:p>
+    <w:p>
+      <w:pPr>
+        <w:spacing w:line="240" w:lineRule="auto"/>
+        <w:rPr>
+          <w:rFonts w:ascii="Times New Roman" w:hAnsi="Times New Roman" w:cs="Times New Roman"/>
+          <w:sz w:val="26"/>
+          <w:szCs w:val="26"/>
+        </w:rPr>
+      </w:pPr>
+      <w:r>
+        <w:rPr>
+          <w:rFonts w:ascii="Times New Roman" w:hAnsi="Times New Roman" w:cs="Times New Roman"/>
+          <w:sz w:val="26"/>
+          <w:szCs w:val="26"/>
+        </w:rPr>
+        <w:t xml:space="preserve">- Loại móng cột dây co dự kiến: </w:t>
+      </w:r>
+      <w:r>
+        <w:rPr>
+          <w:rFonts w:ascii="Segoe UI Symbol" w:hAnsi="Segoe UI Symbol" w:cs="Segoe UI Symbol"/>
+          <w:sz w:val="26"/>
+          <w:szCs w:val="26"/>
+        </w:rPr>
+        <w:t>{{#FOUNDATION_3}}☑{{/FOUNDATION_3}}{{^FOUNDATION_3}}☐{{/FOUNDATION_3}} 3 co</w:t>
+      </w:r>
+      <w:r>
+        <w:rPr>
+          <w:rFonts w:ascii="Times New Roman" w:hAnsi="Times New Roman" w:cs="Times New Roman"/>
+          <w:sz w:val="26"/>
+          <w:szCs w:val="26"/>
+        </w:rPr>
+        <w:t xml:space="preserve"> </w:t>
+      </w:r>
+      <w:r>
+        <w:rPr>
+          <w:rFonts w:ascii="Times New Roman" w:hAnsi="Times New Roman" w:cs="Times New Roman"/>
+          <w:sz w:val="26"/>
+          <w:szCs w:val="26"/>
+        </w:rPr>
+        <w:tab/>
+      </w:r>
+      <w:r>
+        <w:rPr>
+          <w:rFonts w:ascii="Times New Roman" w:hAnsi="Times New Roman" w:cs="Times New Roman"/>
+          <w:sz w:val="26"/>
+          <w:szCs w:val="26"/>
+        </w:rPr>
+        <w:tab/>
+      </w:r>
+      <w:r>
+        <w:rPr>
+          <w:rFonts w:ascii="Segoe UI Symbol" w:hAnsi="Segoe UI Symbol" w:cs="Segoe UI Symbol"/>
+          <w:sz w:val="26"/>
+          <w:szCs w:val="26"/>
+        </w:rPr>
+        <w:t>{{#FOUNDATION_4}}☑{{/FOUNDATION_4}}{{^FOUNDATION_4}}☐{{/FOUNDATION_4}} 4 co</w:t>
+      </w:r>
+    </w:p>
+    <w:p>
+      <w:pPr>
+        <w:spacing w:line="240" w:lineRule="auto"/>
+        <w:rPr>
+          <w:rFonts w:ascii="Times New Roman" w:hAnsi="Times New Roman" w:cs="Times New Roman"/>
+          <w:sz w:val="26"/>
+          <w:szCs w:val="26"/>
+        </w:rPr>
+      </w:pPr>
+      <w:r>
+        <w:rPr>
+          <w:rFonts w:ascii="Times New Roman" w:hAnsi="Times New Roman" w:cs="Times New Roman"/>
+          <w:sz w:val="26"/>
+          <w:szCs w:val="26"/>
+        </w:rPr>
+        <w:t>- Các công trình, vật dụng, cây cối có khả năng xung đột: {{CONFLICT_NOTES}} khi xây dựng trạm BTS/cột anten/móng cột (số lượng/loại</w:t>
+      </w:r>
+      <w:r>
+        <w:rPr>
+          <w:rFonts w:ascii="Times New Roman" w:hAnsi="Times New Roman" w:cs="Times New Roman"/>
+          <w:sz w:val="26"/>
+          <w:szCs w:val="26"/>
+        </w:rPr>
+        <w:t xml:space="preserve"> và trách nhiệm thực hiện</w:t>
+      </w:r>
+      <w:r>
+        <w:rPr>
+          <w:rFonts w:ascii="Times New Roman" w:hAnsi="Times New Roman" w:cs="Times New Roman"/>
+          <w:sz w:val="26"/>
+          <w:szCs w:val="26"/>
+        </w:rPr>
+        <w:t>):</w:t>
+      </w:r>
+      <w:r>
+        <w:rPr>
+          <w:rFonts w:ascii="Times New Roman" w:hAnsi="Times New Roman" w:cs="Times New Roman"/>
+          <w:sz w:val="26"/>
+          <w:szCs w:val="26"/>
+        </w:rPr>
+        <w:t xml:space="preserve"> </w:t>
+      </w:r>
+      <w:r>
+        <w:rPr>
+          <w:rFonts w:ascii="Times New Roman" w:hAnsi="Times New Roman" w:cs="Times New Roman"/>
+          <w:sz w:val="26"/>
+          <w:szCs w:val="26"/>
+        </w:rPr>
+        <w:t>……</w:t>
+      </w:r>
+      <w:r>
+        <w:rPr>
+          <w:rFonts w:ascii="Times New Roman" w:hAnsi="Times New Roman" w:cs="Times New Roman"/>
+          <w:sz w:val="26"/>
+          <w:szCs w:val="26"/>
+        </w:rPr>
+        <w:t>…………….</w:t>
+      </w:r>
+      <w:r>
+        <w:rPr>
+          <w:rFonts w:ascii="Times New Roman" w:hAnsi="Times New Roman" w:cs="Times New Roman"/>
+          <w:sz w:val="26"/>
+          <w:szCs w:val="26"/>
+        </w:rPr>
+        <w:t>…</w:t>
+      </w:r>
+      <w:r>
+        <w:rPr>
+          <w:rFonts w:ascii="Times New Roman" w:hAnsi="Times New Roman" w:cs="Times New Roman"/>
+          <w:sz w:val="26"/>
+          <w:szCs w:val="26"/>
+        </w:rPr>
+        <w:t>…………………………………………………………………………………………………………………………………………………</w:t>
+      </w:r>
+      <w:r>
+        <w:rPr>
+          <w:rFonts w:ascii="Times New Roman" w:hAnsi="Times New Roman" w:cs="Times New Roman"/>
+          <w:sz w:val="26"/>
+          <w:szCs w:val="26"/>
+        </w:rPr>
+        <w:t>………………….</w:t>
+      </w:r>
+    </w:p>
+    <w:p>
+      <w:pPr>
+        <w:spacing w:line="240" w:lineRule="auto"/>
+        <w:rPr>
+          <w:rFonts w:ascii="Times New Roman" w:hAnsi="Times New Roman" w:cs="Times New Roman"/>
+          <w:sz w:val="26"/>
+          <w:szCs w:val="26"/>
+        </w:rPr>
+      </w:pPr>
+      <w:r>
+        <w:rPr>
+          <w:rFonts w:ascii="Times New Roman" w:hAnsi="Times New Roman" w:cs="Times New Roman"/>
+          <w:sz w:val="26"/>
+          <w:szCs w:val="26"/>
+        </w:rPr>
+        <w:t xml:space="preserve">- </w:t>
+      </w:r>
+      <w:r>
+        <w:rPr>
+          <w:rFonts w:ascii="Times New Roman" w:hAnsi="Times New Roman" w:cs="Times New Roman"/>
+          <w:sz w:val="26"/>
+          <w:szCs w:val="26"/>
+        </w:rPr>
+        <w:t>Ý kiến</w:t>
+      </w:r>
+      <w:r>
+        <w:rPr>
+          <w:rFonts w:ascii="Times New Roman" w:hAnsi="Times New Roman" w:cs="Times New Roman"/>
+          <w:sz w:val="26"/>
+          <w:szCs w:val="26"/>
+        </w:rPr>
+        <w:t xml:space="preserve"> khác: .....................................................</w:t>
+      </w:r>
+      <w:r>
+        <w:rPr>
+          <w:rFonts w:ascii="Times New Roman" w:hAnsi="Times New Roman" w:cs="Times New Roman"/>
+          <w:sz w:val="26"/>
+          <w:szCs w:val="26"/>
+        </w:rPr>
+        <w:t>................................................................</w:t>
+      </w:r>
+    </w:p>
+    <w:p>
+      <w:pPr>
+        <w:spacing w:line="240" w:lineRule="auto"/>
+        <w:rPr>
+          <w:rFonts w:ascii="Times New Roman" w:hAnsi="Times New Roman" w:cs="Times New Roman"/>
+          <w:sz w:val="26"/>
+          <w:szCs w:val="26"/>
+        </w:rPr>
+      </w:pPr>
+      <w:r>
+        <w:rPr>
+          <w:rFonts w:ascii="Times New Roman" w:hAnsi="Times New Roman" w:cs="Times New Roman"/>
+          <w:sz w:val="26"/>
+          <w:szCs w:val="26"/>
+        </w:rPr>
+        <w:t>- Ảnh chụp hiện trạng, vẽ sơ bộ mặt bằng khu đất và bố trí dự kiến theo phụ lục đính kèm.</w:t>
+      </w:r>
+    </w:p>
+    <w:p>
+      <w:pPr>
+        <w:spacing w:line="240" w:lineRule="auto"/>
+        <w:rPr>
+          <w:rFonts w:ascii="Times New Roman" w:hAnsi="Times New Roman" w:cs="Times New Roman"/>
+          <w:b/>
+          <w:bCs/>
+          <w:sz w:val="26"/>
+          <w:szCs w:val="26"/>
+        </w:rPr>
+      </w:pPr>
+      <w:r>
+        <w:rPr>
+          <w:rFonts w:ascii="Times New Roman" w:hAnsi="Times New Roman" w:cs="Times New Roman"/>
+          <w:b/>
+          <w:bCs/>
+          <w:sz w:val="26"/>
+          <w:szCs w:val="26"/>
+        </w:rPr>
+        <w:t xml:space="preserve">V. </w:t>
+      </w:r>
+      <w:r>
+        <w:rPr>
+          <w:rFonts w:ascii="Times New Roman" w:hAnsi="Times New Roman" w:cs="Times New Roman"/>
+          <w:b/>
+          <w:bCs/>
+          <w:sz w:val="26"/>
+          <w:szCs w:val="26"/>
+        </w:rPr>
+        <w:t xml:space="preserve">THỜI GIAN THUÊ, </w:t>
+      </w:r>
+      <w:r>
+        <w:rPr>
+          <w:rFonts w:ascii="Times New Roman" w:hAnsi="Times New Roman" w:cs="Times New Roman"/>
+          <w:b/>
+          <w:bCs/>
+          <w:sz w:val="26"/>
+          <w:szCs w:val="26"/>
+        </w:rPr>
+        <w:t>GIÁ THUÊ VÀ PHƯƠNG THỨC THANH TOÁN</w:t>
+      </w:r>
+    </w:p>
+    <w:p>
+      <w:pPr>
+        <w:pStyle w:val="ListParagraph"/>
+        <w:numPr>
+          <w:ilvl w:val="0"/>
+          <w:numId w:val="14"/>
+        </w:numPr>
+        <w:tabs>
+          <w:tab w:val="center" w:pos="4222"/>
+          <w:tab w:val="left" w:pos="6521"/>
+        </w:tabs>
+        <w:rPr>
+          <w:rFonts w:ascii="Times New Roman" w:hAnsi="Times New Roman" w:cs="Times New Roman"/>
+          <w:bCs/>
+          <w:sz w:val="26"/>
+          <w:szCs w:val="26"/>
+        </w:rPr>
+      </w:pPr>
+      <w:r>
+        <w:rPr>
+          <w:rFonts w:ascii="Times New Roman" w:hAnsi="Times New Roman" w:cs="Times New Roman"/>
+          <w:bCs/>
+          <w:sz w:val="26"/>
+          <w:szCs w:val="26"/>
+        </w:rPr>
+        <w:t>Thời gian thuê: {{LEASE_TERM}} năm.</w:t>
+      </w:r>
+      <w:r>
+        <w:rPr>
+          <w:rFonts w:ascii="Times New Roman" w:hAnsi="Times New Roman" w:cs="Times New Roman"/>
+          <w:bCs/>
+          <w:sz w:val="26"/>
+          <w:szCs w:val="26"/>
+        </w:rPr>
+        <w:t>………</w:t>
+      </w:r>
+      <w:r>
+        <w:rPr>
+          <w:rFonts w:ascii="Times New Roman" w:hAnsi="Times New Roman" w:cs="Times New Roman"/>
+          <w:bCs/>
+          <w:sz w:val="26"/>
+          <w:szCs w:val="26"/>
+        </w:rPr>
+        <w:t xml:space="preserve"> năm.</w:t>
+      </w:r>
+    </w:p>
+    <w:p>
+      <w:pPr>
+        <w:pStyle w:val="ListParagraph"/>
+        <w:numPr>
+          <w:ilvl w:val="0"/>
+          <w:numId w:val="14"/>
+        </w:numPr>
+        <w:tabs>
+          <w:tab w:val="center" w:pos="4222"/>
+        </w:tabs>
+        <w:rPr>
+          <w:rFonts w:ascii="Times New Roman" w:hAnsi="Times New Roman" w:cs="Times New Roman"/>
+          <w:bCs/>
+          <w:i/>
+          <w:iCs/>
+          <w:sz w:val="26"/>
+          <w:szCs w:val="26"/>
+        </w:rPr>
+      </w:pPr>
+      <w:r>
+        <w:rPr>
+          <w:rFonts w:ascii="Times New Roman" w:hAnsi="Times New Roman" w:cs="Times New Roman"/>
+          <w:bCs/>
+          <w:sz w:val="26"/>
+          <w:szCs w:val="26"/>
+        </w:rPr>
+        <w:t>Giá thuê: {{RENT_FEE}} đồng/tháng.………………………</w:t>
+      </w:r>
+      <w:r>
+        <w:rPr>
+          <w:rFonts w:ascii="Times New Roman" w:hAnsi="Times New Roman" w:cs="Times New Roman"/>
+          <w:bCs/>
+          <w:sz w:val="26"/>
+          <w:szCs w:val="26"/>
+        </w:rPr>
+        <w:t xml:space="preserve"> </w:t>
+      </w:r>
+      <w:r>
+        <w:rPr>
+          <w:rFonts w:ascii="Times New Roman" w:hAnsi="Times New Roman" w:cs="Times New Roman"/>
+          <w:bCs/>
+          <w:sz w:val="26"/>
+          <w:szCs w:val="26"/>
+        </w:rPr>
+        <w:t>đồng / tháng.</w:t>
+      </w:r>
+    </w:p>
+    <w:p>
+      <w:pPr>
+        <w:pStyle w:val="ListParagraph"/>
+        <w:tabs>
+          <w:tab w:val="center" w:pos="4222"/>
+        </w:tabs>
+        <w:rPr>
+          <w:rFonts w:ascii="Times New Roman" w:hAnsi="Times New Roman" w:cs="Times New Roman"/>
+          <w:bCs/>
+          <w:i/>
+          <w:iCs/>
+          <w:sz w:val="26"/>
+          <w:szCs w:val="26"/>
+        </w:rPr>
+      </w:pPr>
+      <w:r>
+        <w:rPr>
+          <w:rFonts w:ascii="Times New Roman" w:hAnsi="Times New Roman" w:cs="Times New Roman"/>
+          <w:bCs/>
+          <w:i/>
+          <w:iCs/>
+          <w:sz w:val="26"/>
+          <w:szCs w:val="26"/>
+        </w:rPr>
+        <w:t>(</w:t>
+      </w:r>
+      <w:r>
+        <w:rPr>
+          <w:rFonts w:ascii="Times New Roman" w:hAnsi="Times New Roman" w:cs="Times New Roman"/>
+          <w:bCs/>
+          <w:i/>
+          <w:iCs/>
+          <w:sz w:val="26"/>
+          <w:szCs w:val="26"/>
+        </w:rPr>
+        <w:tab/>
+        <w:t>Bằng chữ: {{RENT_FEE_TEXT}}………………………………………………………………………)</w:t>
+      </w:r>
+    </w:p>
+    <w:p>
+      <w:pPr>
+        <w:pStyle w:val="ListParagraph"/>
+        <w:numPr>
+          <w:ilvl w:val="0"/>
+          <w:numId w:val="13"/>
+        </w:numPr>
+        <w:tabs>
+          <w:tab w:val="center" w:pos="4222"/>
+        </w:tabs>
+        <w:ind w:left="1134"/>
+        <w:rPr>
+          <w:rFonts w:ascii="Times New Roman" w:hAnsi="Times New Roman" w:cs="Times New Roman"/>
+          <w:bCs/>
+          <w:sz w:val="26"/>
+          <w:szCs w:val="26"/>
+        </w:rPr>
+      </w:pPr>
+      <w:r>
+        <w:rPr>
+          <w:rFonts w:ascii="Times New Roman" w:hAnsi="Times New Roman" w:cs="Times New Roman"/>
+          <w:bCs/>
+          <w:sz w:val="26"/>
+          <w:szCs w:val="26"/>
+        </w:rPr>
+        <w:t>Giá thuê bao gồm các loại thuế do Nhà Nước quy định.</w:t>
+      </w:r>
+    </w:p>
+    <w:p>
+      <w:pPr>
+        <w:pStyle w:val="ListParagraph"/>
+        <w:numPr>
+          <w:ilvl w:val="0"/>
+          <w:numId w:val="13"/>
+        </w:numPr>
+        <w:tabs>
+          <w:tab w:val="center" w:pos="4222"/>
+        </w:tabs>
+        <w:ind w:left="1134"/>
+        <w:rPr>
+          <w:rFonts w:ascii="Times New Roman" w:hAnsi="Times New Roman" w:cs="Times New Roman"/>
+          <w:bCs/>
+          <w:sz w:val="26"/>
+          <w:szCs w:val="26"/>
+        </w:rPr>
+      </w:pPr>
+      <w:r>
+        <w:rPr>
+          <w:rFonts w:ascii="Times New Roman" w:hAnsi="Times New Roman" w:cs="Times New Roman"/>
+          <w:bCs/>
+          <w:sz w:val="26"/>
+          <w:szCs w:val="26"/>
+        </w:rPr>
+        <w:t>Giá thuê không thay đổi suốt thời gian thuê.</w:t>
+      </w:r>
+    </w:p>
+    <w:p>
+      <w:pPr>
+        <w:pStyle w:val="ListParagraph"/>
+        <w:numPr>
+          <w:ilvl w:val="0"/>
+          <w:numId w:val="13"/>
+        </w:numPr>
+        <w:tabs>
+          <w:tab w:val="center" w:pos="4222"/>
+        </w:tabs>
+        <w:ind w:left="1134"/>
+        <w:rPr>
+          <w:rFonts w:ascii="Times New Roman" w:hAnsi="Times New Roman" w:cs="Times New Roman"/>
+          <w:bCs/>
+          <w:sz w:val="26"/>
+          <w:szCs w:val="26"/>
+        </w:rPr>
+      </w:pPr>
+      <w:r>
+        <w:rPr>
+          <w:rFonts w:ascii="Times New Roman" w:hAnsi="Times New Roman" w:cs="Times New Roman"/>
+          <w:bCs/>
+          <w:sz w:val="26"/>
+          <w:szCs w:val="26"/>
+        </w:rPr>
+        <w:t xml:space="preserve">Thanh toán </w:t>
+      </w:r>
+      <w:r>
+        <w:rPr>
+          <w:rFonts w:ascii="Times New Roman" w:hAnsi="Times New Roman" w:cs="Times New Roman"/>
+          <w:bCs/>
+          <w:sz w:val="26"/>
+          <w:szCs w:val="26"/>
+        </w:rPr>
+        <w:t xml:space="preserve">đầu kỳ </w:t>
+      </w:r>
+      <w:r>
+        <w:rPr>
+          <w:rFonts w:ascii="Times New Roman" w:hAnsi="Times New Roman" w:cs="Times New Roman"/>
+          <w:bCs/>
+          <w:sz w:val="26"/>
+          <w:szCs w:val="26"/>
+        </w:rPr>
+        <w:t>06 tháng 01 lần.</w:t>
+      </w:r>
+    </w:p>
+    <w:p>
+      <w:pPr>
+        <w:pStyle w:val="ListParagraph"/>
+        <w:numPr>
+          <w:ilvl w:val="0"/>
+          <w:numId w:val="14"/>
+        </w:numPr>
+        <w:tabs>
+          <w:tab w:val="center" w:pos="4222"/>
+        </w:tabs>
+        <w:jc w:val="both"/>
+        <w:rPr>
+          <w:rFonts w:ascii="Times New Roman" w:hAnsi="Times New Roman" w:cs="Times New Roman"/>
+          <w:bCs/>
+          <w:sz w:val="26"/>
+          <w:szCs w:val="26"/>
+        </w:rPr>
+      </w:pPr>
+      <w:r>
+        <w:rPr>
+          <w:rFonts w:ascii="Times New Roman" w:hAnsi="Times New Roman" w:cs="Times New Roman"/>
+          <w:bCs/>
+          <w:sz w:val="26"/>
+          <w:szCs w:val="26"/>
+        </w:rPr>
+        <w:t xml:space="preserve">Thời điểm bắt đầu tính tiền: </w:t>
+      </w:r>
+      <w:r>
+        <w:rPr>
+          <w:rFonts w:ascii="Times New Roman" w:hAnsi="Times New Roman" w:cs="Times New Roman"/>
+          <w:bCs/>
+          <w:sz w:val="26"/>
+          <w:szCs w:val="26"/>
+        </w:rPr>
+        <w:t>Kể từ ngày bên A lắp đặt thiết bị phát sóng trạm.</w:t>
+      </w:r>
+    </w:p>
+    <w:p>
+      <w:pPr>
+        <w:tabs>
+          <w:tab w:val="left" w:pos="709"/>
+          <w:tab w:val="center" w:pos="4222"/>
+        </w:tabs>
+        <w:spacing w:after="0" w:line="240" w:lineRule="auto"/>
+        <w:jc w:val="both"/>
+        <w:rPr>
+          <w:rFonts w:ascii="Times New Roman" w:hAnsi="Times New Roman" w:cs="Times New Roman"/>
+          <w:bCs/>
+          <w:sz w:val="26"/>
+          <w:szCs w:val="26"/>
+        </w:rPr>
+      </w:pPr>
+      <w:r>
+        <w:rPr>
+          <w:rFonts w:ascii="Times New Roman" w:hAnsi="Times New Roman" w:cs="Times New Roman"/>
+          <w:bCs/>
+          <w:sz w:val="26"/>
+          <w:szCs w:val="26"/>
+        </w:rPr>
+        <w:t xml:space="preserve">Biên bản ghi nhớ này chính là cơ sở để </w:t>
+      </w:r>
+      <w:r>
+        <w:rPr>
+          <w:rFonts w:ascii="Times New Roman" w:hAnsi="Times New Roman" w:cs="Times New Roman"/>
+          <w:bCs/>
+          <w:sz w:val="26"/>
+          <w:szCs w:val="26"/>
+        </w:rPr>
+        <w:t xml:space="preserve">tiến hành </w:t>
+      </w:r>
+      <w:r>
+        <w:rPr>
+          <w:rFonts w:ascii="Times New Roman" w:hAnsi="Times New Roman" w:cs="Times New Roman"/>
+          <w:bCs/>
+          <w:sz w:val="26"/>
+          <w:szCs w:val="26"/>
+        </w:rPr>
+        <w:t>ký kết hợp đồng giữa hai bên.</w:t>
+      </w:r>
+    </w:p>
+    <w:p>
+      <w:pPr>
+        <w:spacing w:line="240" w:lineRule="auto"/>
+        <w:rPr>
+          <w:rFonts w:ascii="Times New Roman" w:hAnsi="Times New Roman" w:cs="Times New Roman"/>
+          <w:sz w:val="26"/>
+          <w:szCs w:val="26"/>
+        </w:rPr>
+      </w:pPr>
+      <w:r>
+        <w:rPr>
+          <w:rFonts w:ascii="Times New Roman" w:hAnsi="Times New Roman" w:cs="Times New Roman"/>
+          <w:sz w:val="26"/>
+          <w:szCs w:val="26"/>
+        </w:rPr>
+        <w:t>Biên bản lập thành 02 bản, mỗi bên giữ 01 bản.</w:t>
+      </w:r>
+    </w:p>
+    <w:tbl>
+      <w:tblPr>
+        <w:tblStyle w:val="TableGrid"/>
+        <w:tblW w:w="0" w:type="auto"/>
+        <w:tblBorders>
+          <w:top w:val="none" w:sz="0" w:space="0" w:color="auto"/>
+          <w:left w:val="none" w:sz="0" w:space="0" w:color="auto"/>
+          <w:bottom w:val="none" w:sz="0" w:space="0" w:color="auto"/>
+          <w:right w:val="none" w:sz="0" w:space="0" w:color="auto"/>
+          <w:insideH w:val="none" w:sz="0" w:space="0" w:color="auto"/>
+          <w:insideV w:val="none" w:sz="0" w:space="0" w:color="auto"/>
+        </w:tblBorders>
+        <w:tblLook w:val="04A0" w:firstRow="1" w:lastRow="0" w:firstColumn="1" w:lastColumn="0" w:noHBand="0" w:noVBand="1"/>
+      </w:tblPr>
+      <w:tblGrid>
+        <w:gridCol w:w="4696"/>
+        <w:gridCol w:w="4709"/>
+      </w:tblGrid>
+      <w:tr>
+        <w:tc>
+          <w:tcPr>
+            <w:tcW w:w="4810" w:type="dxa"/>
+          </w:tcPr>
+          <w:p>
+            <w:pPr>
+              <w:jc w:val="center"/>
+              <w:rPr>
+                <w:rFonts w:ascii="Times New Roman" w:hAnsi="Times New Roman" w:cs="Times New Roman"/>
+                <w:b/>
+                <w:bCs/>
+                <w:sz w:val="26"/>
+                <w:szCs w:val="26"/>
+              </w:rPr>
+            </w:pPr>
+            <w:r>
+              <w:rPr>
+                <w:rFonts w:ascii="Times New Roman" w:hAnsi="Times New Roman" w:cs="Times New Roman"/>
+                <w:b/>
+                <w:bCs/>
+                <w:sz w:val="26"/>
+                <w:szCs w:val="26"/>
+              </w:rPr>
+              <w:t xml:space="preserve">ĐẠI DIỆN </w:t>
+            </w:r>
+            <w:r>
+              <w:rPr>
+                <w:rFonts w:ascii="Times New Roman" w:hAnsi="Times New Roman" w:cs="Times New Roman"/>
+                <w:b/>
+                <w:bCs/>
+                <w:sz w:val="26"/>
+                <w:szCs w:val="26"/>
+              </w:rPr>
+              <w:t>MBF ĐỒNG NAI</w:t>
+            </w:r>
+          </w:p>
+          <w:p>
+            <w:pPr>
+              <w:jc w:val="center"/>
+              <w:rPr>
+                <w:rFonts w:ascii="Times New Roman" w:hAnsi="Times New Roman" w:cs="Times New Roman"/>
+                <w:sz w:val="26"/>
+                <w:szCs w:val="26"/>
+              </w:rPr>
+            </w:pPr>
+            <w:r>
+              <w:rPr>
+                <w:rFonts w:ascii="Times New Roman" w:hAnsi="Times New Roman" w:cs="Times New Roman"/>
+                <w:sz w:val="26"/>
+                <w:szCs w:val="26"/>
+              </w:rPr>
+              <w:t>Người khảo sát          N</w:t>
+            </w:r>
+            <w:r>
+              <w:rPr>
+                <w:rFonts w:ascii="Times New Roman" w:hAnsi="Times New Roman" w:cs="Times New Roman"/>
+                <w:sz w:val="26"/>
+                <w:szCs w:val="26"/>
+              </w:rPr>
+              <w:t>g</w:t>
+            </w:r>
+            <w:r>
+              <w:rPr>
+                <w:rFonts w:ascii="Times New Roman" w:hAnsi="Times New Roman" w:cs="Times New Roman"/>
+                <w:sz w:val="26"/>
+                <w:szCs w:val="26"/>
+              </w:rPr>
+              <w:t>ười kiểm tra</w:t>
+            </w:r>
+          </w:p>
+        </w:tc>
+        <w:tc>
+          <w:tcPr>
+            <w:tcW w:w="4811" w:type="dxa"/>
+          </w:tcPr>
+          <w:p>
+            <w:pPr>
+              <w:jc w:val="center"/>
+              <w:rPr>
+                <w:rFonts w:ascii="Times New Roman" w:hAnsi="Times New Roman" w:cs="Times New Roman"/>
+                <w:b/>
+                <w:bCs/>
+                <w:sz w:val="26"/>
+                <w:szCs w:val="26"/>
+              </w:rPr>
+            </w:pPr>
+            <w:r>
+              <w:rPr>
+                <w:rFonts w:ascii="Times New Roman" w:hAnsi="Times New Roman" w:cs="Times New Roman"/>
+                <w:b/>
+                <w:bCs/>
+                <w:sz w:val="26"/>
+                <w:szCs w:val="26"/>
+              </w:rPr>
+              <w:t>CHỦ ĐẤT/CHỦ NHÀ</w:t>
+            </w:r>
+          </w:p>
+          <w:p>
+            <w:pPr>
+              <w:jc w:val="center"/>
+              <w:rPr>
+                <w:rFonts w:ascii="Times New Roman" w:hAnsi="Times New Roman" w:cs="Times New Roman"/>
+                <w:b/>
+                <w:bCs/>
+                <w:sz w:val="26"/>
+                <w:szCs w:val="26"/>
+              </w:rPr>
+            </w:pPr>
+            <w:r>
+              <w:rPr>
+                <w:rFonts w:ascii="Times New Roman" w:hAnsi="Times New Roman" w:cs="Times New Roman"/>
+                <w:sz w:val="26"/>
+                <w:szCs w:val="26"/>
+              </w:rPr>
+              <w:t>(Ký, ghi rõ họ tên)</w:t>
+            </w:r>
+          </w:p>
+        </w:tc>
+      </w:tr>
+    </w:tbl>
+    <w:p>
+      <w:pPr>
+        <w:rPr>
+          <w:rFonts w:ascii="Times New Roman" w:hAnsi="Times New Roman" w:cs="Times New Roman"/>
+          <w:b/>
+          <w:bCs/>
+          <w:sz w:val="26"/>
+          <w:szCs w:val="26"/>
+        </w:rPr>
+      </w:pPr>
+      <w:bookmarkStart w:id="0" w:name="_GoBack"/>
+      <w:bookmarkEnd w:id="0"/>
+    </w:p>
+    <w:sectPr>
+      <w:pgSz w:w="12240" w:h="15840"/>
+      <w:pgMar w:top="990" w:right="1134" w:bottom="1134" w:left="1701" w:header="720" w:footer="720" w:gutter="0"/>
+      <w:cols w:space="720"/>
+      <w:docGrid w:linePitch="360"/>
+    </w:sectPr>
+  </w:body>
+</w:document>
 </file>
 
 <file path=word/numbering.xml><?xml version="1.0" encoding="utf-8"?>

</xml_diff>